<commit_message>
Seat stale window, gift event enrich, SSE Last-Event-Id
</commit_message>
<xml_diff>
--- a/FLUTTER_CANLI_FALCILAR_TRTC_HEDIYE_PROMPT.docx
+++ b/FLUTTER_CANLI_FALCILAR_TRTC_HEDIYE_PROMPT.docx
@@ -2,7 +2,7 @@
 <file path=word/document.xml><?xml version="1.0" encoding="utf-8"?>
 <w:document xmlns:w="http://schemas.openxmlformats.org/wordprocessingml/2006/main" xmlns:m="http://schemas.openxmlformats.org/officeDocument/2006/math" xmlns:r="http://schemas.openxmlformats.org/officeDocument/2006/relationships" xmlns:o="urn:schemas-microsoft-com:office:office" xmlns:v="urn:schemas-microsoft-com:vml" xmlns:w10="urn:schemas-microsoft-com:office:word" xmlns:a="http://schemas.openxmlformats.org/drawingml/2006/main" xmlns:pic="http://schemas.openxmlformats.org/drawingml/2006/picture" xmlns:wp="http://schemas.openxmlformats.org/drawingml/2006/wordprocessingDrawing">
   <w:body>
-    <w:bookmarkStart w:id="45" w:name="X9f73b1248f7dfe6f42159130627e44a1b0f12bc"/>
+    <w:bookmarkStart w:id="55" w:name="X9f73b1248f7dfe6f42159130627e44a1b0f12bc"/>
     <w:p>
       <w:pPr>
         <w:pStyle w:val="Heading1"/>
@@ -2398,6 +2398,211 @@
               <w:rPr>
                 <w:rStyle w:val="VerbatimChar"/>
               </w:rPr>
+              <w:t xml:space="preserve">giftId</w:t>
+            </w:r>
+          </w:p>
+        </w:tc>
+        <w:tc>
+          <w:tcPr/>
+          <w:p>
+            <w:pPr>
+              <w:pStyle w:val="Compact"/>
+              <w:jc w:val="left"/>
+            </w:pPr>
+            <w:r>
+              <w:t xml:space="preserve">string</w:t>
+            </w:r>
+          </w:p>
+        </w:tc>
+        <w:tc>
+          <w:tcPr/>
+          <w:p>
+            <w:pPr>
+              <w:pStyle w:val="Compact"/>
+              <w:jc w:val="left"/>
+            </w:pPr>
+            <w:r>
+              <w:rPr>
+                <w:bCs/>
+                <w:b/>
+              </w:rPr>
+              <w:t xml:space="preserve">Olayın tekil kimliği</w:t>
+            </w:r>
+            <w:r>
+              <w:t xml:space="preserve"> </w:t>
+            </w:r>
+            <w:r>
+              <w:t xml:space="preserve">— animasyonu tekilleştirmek (dedupe) için</w:t>
+            </w:r>
+          </w:p>
+        </w:tc>
+      </w:tr>
+      <w:tr>
+        <w:tc>
+          <w:tcPr/>
+          <w:p>
+            <w:pPr>
+              <w:pStyle w:val="Compact"/>
+              <w:jc w:val="left"/>
+            </w:pPr>
+            <w:r>
+              <w:rPr>
+                <w:rStyle w:val="VerbatimChar"/>
+              </w:rPr>
+              <w:t xml:space="preserve">timestamp</w:t>
+            </w:r>
+          </w:p>
+        </w:tc>
+        <w:tc>
+          <w:tcPr/>
+          <w:p>
+            <w:pPr>
+              <w:pStyle w:val="Compact"/>
+              <w:jc w:val="left"/>
+            </w:pPr>
+            <w:r>
+              <w:t xml:space="preserve">int</w:t>
+            </w:r>
+          </w:p>
+        </w:tc>
+        <w:tc>
+          <w:tcPr/>
+          <w:p>
+            <w:pPr>
+              <w:pStyle w:val="Compact"/>
+              <w:jc w:val="left"/>
+            </w:pPr>
+            <w:r>
+              <w:t xml:space="preserve">Olayın backend zaman damgası (ms). Katılımdan</w:t>
+            </w:r>
+            <w:r>
+              <w:t xml:space="preserve"> </w:t>
+            </w:r>
+            <w:r>
+              <w:rPr>
+                <w:bCs/>
+                <w:b/>
+              </w:rPr>
+              <w:t xml:space="preserve">önceki</w:t>
+            </w:r>
+            <w:r>
+              <w:t xml:space="preserve"> </w:t>
+            </w:r>
+            <w:r>
+              <w:t xml:space="preserve">hediyeleri elemek için</w:t>
+            </w:r>
+          </w:p>
+        </w:tc>
+      </w:tr>
+      <w:tr>
+        <w:tc>
+          <w:tcPr/>
+          <w:p>
+            <w:pPr>
+              <w:pStyle w:val="Compact"/>
+              <w:jc w:val="left"/>
+            </w:pPr>
+            <w:r>
+              <w:rPr>
+                <w:rStyle w:val="VerbatimChar"/>
+              </w:rPr>
+              <w:t xml:space="preserve">senderId</w:t>
+            </w:r>
+          </w:p>
+        </w:tc>
+        <w:tc>
+          <w:tcPr/>
+          <w:p>
+            <w:pPr>
+              <w:pStyle w:val="Compact"/>
+              <w:jc w:val="left"/>
+            </w:pPr>
+            <w:r>
+              <w:t xml:space="preserve">string</w:t>
+            </w:r>
+          </w:p>
+        </w:tc>
+        <w:tc>
+          <w:tcPr/>
+          <w:p>
+            <w:pPr>
+              <w:pStyle w:val="Compact"/>
+              <w:jc w:val="left"/>
+            </w:pPr>
+            <w:r>
+              <w:t xml:space="preserve">Gönderen kullanıcı id</w:t>
+            </w:r>
+          </w:p>
+        </w:tc>
+      </w:tr>
+      <w:tr>
+        <w:tc>
+          <w:tcPr/>
+          <w:p>
+            <w:pPr>
+              <w:pStyle w:val="Compact"/>
+              <w:jc w:val="left"/>
+            </w:pPr>
+            <w:r>
+              <w:rPr>
+                <w:rStyle w:val="VerbatimChar"/>
+              </w:rPr>
+              <w:t xml:space="preserve">recipientId</w:t>
+            </w:r>
+            <w:r>
+              <w:t xml:space="preserve"> </w:t>
+            </w:r>
+            <w:r>
+              <w:t xml:space="preserve">/</w:t>
+            </w:r>
+            <w:r>
+              <w:t xml:space="preserve"> </w:t>
+            </w:r>
+            <w:r>
+              <w:rPr>
+                <w:rStyle w:val="VerbatimChar"/>
+              </w:rPr>
+              <w:t xml:space="preserve">receiverId</w:t>
+            </w:r>
+          </w:p>
+        </w:tc>
+        <w:tc>
+          <w:tcPr/>
+          <w:p>
+            <w:pPr>
+              <w:pStyle w:val="Compact"/>
+              <w:jc w:val="left"/>
+            </w:pPr>
+            <w:r>
+              <w:t xml:space="preserve">string?</w:t>
+            </w:r>
+          </w:p>
+        </w:tc>
+        <w:tc>
+          <w:tcPr/>
+          <w:p>
+            <w:pPr>
+              <w:pStyle w:val="Compact"/>
+              <w:jc w:val="left"/>
+            </w:pPr>
+            <w:r>
+              <w:t xml:space="preserve">Alıcı kullanıcı id (varsa)</w:t>
+            </w:r>
+          </w:p>
+        </w:tc>
+      </w:tr>
+      <w:tr>
+        <w:tc>
+          <w:tcPr/>
+          <w:p>
+            <w:pPr>
+              <w:pStyle w:val="Compact"/>
+              <w:jc w:val="left"/>
+            </w:pPr>
+            <w:r>
+              <w:rPr>
+                <w:rStyle w:val="VerbatimChar"/>
+              </w:rPr>
               <w:t xml:space="preserve">giftIcon</w:t>
             </w:r>
           </w:p>
@@ -2568,6 +2773,581 @@
                 <w:rStyle w:val="VerbatimChar"/>
               </w:rPr>
               <w:t xml:space="preserve">gif</w:t>
+            </w:r>
+          </w:p>
+        </w:tc>
+      </w:tr>
+      <w:tr>
+        <w:tc>
+          <w:tcPr/>
+          <w:p>
+            <w:pPr>
+              <w:pStyle w:val="Compact"/>
+              <w:jc w:val="left"/>
+            </w:pPr>
+            <w:r>
+              <w:rPr>
+                <w:rStyle w:val="VerbatimChar"/>
+              </w:rPr>
+              <w:t xml:space="preserve">assetFormat</w:t>
+            </w:r>
+          </w:p>
+        </w:tc>
+        <w:tc>
+          <w:tcPr/>
+          <w:p>
+            <w:pPr>
+              <w:pStyle w:val="Compact"/>
+              <w:jc w:val="left"/>
+            </w:pPr>
+            <w:r>
+              <w:t xml:space="preserve">string?</w:t>
+            </w:r>
+          </w:p>
+        </w:tc>
+        <w:tc>
+          <w:tcPr/>
+          <w:p>
+            <w:pPr>
+              <w:pStyle w:val="Compact"/>
+              <w:jc w:val="left"/>
+            </w:pPr>
+            <w:r>
+              <w:rPr>
+                <w:bCs/>
+                <w:b/>
+              </w:rPr>
+              <w:t xml:space="preserve">Kesin format</w:t>
+            </w:r>
+            <w:r>
+              <w:t xml:space="preserve"> </w:t>
+            </w:r>
+            <w:r>
+              <w:t xml:space="preserve">(backend türetir):</w:t>
+            </w:r>
+            <w:r>
+              <w:t xml:space="preserve"> </w:t>
+            </w:r>
+            <w:r>
+              <w:rPr>
+                <w:rStyle w:val="VerbatimChar"/>
+              </w:rPr>
+              <w:t xml:space="preserve">png</w:t>
+            </w:r>
+            <w:r>
+              <w:t xml:space="preserve"> </w:t>
+            </w:r>
+            <w:r>
+              <w:t xml:space="preserve">|</w:t>
+            </w:r>
+            <w:r>
+              <w:t xml:space="preserve"> </w:t>
+            </w:r>
+            <w:r>
+              <w:rPr>
+                <w:rStyle w:val="VerbatimChar"/>
+              </w:rPr>
+              <w:t xml:space="preserve">jpeg</w:t>
+            </w:r>
+            <w:r>
+              <w:t xml:space="preserve"> </w:t>
+            </w:r>
+            <w:r>
+              <w:t xml:space="preserve">|</w:t>
+            </w:r>
+            <w:r>
+              <w:t xml:space="preserve"> </w:t>
+            </w:r>
+            <w:r>
+              <w:rPr>
+                <w:rStyle w:val="VerbatimChar"/>
+              </w:rPr>
+              <w:t xml:space="preserve">webp</w:t>
+            </w:r>
+            <w:r>
+              <w:t xml:space="preserve"> </w:t>
+            </w:r>
+            <w:r>
+              <w:t xml:space="preserve">|</w:t>
+            </w:r>
+            <w:r>
+              <w:t xml:space="preserve"> </w:t>
+            </w:r>
+            <w:r>
+              <w:rPr>
+                <w:rStyle w:val="VerbatimChar"/>
+              </w:rPr>
+              <w:t xml:space="preserve">avif</w:t>
+            </w:r>
+            <w:r>
+              <w:t xml:space="preserve"> </w:t>
+            </w:r>
+            <w:r>
+              <w:t xml:space="preserve">|</w:t>
+            </w:r>
+            <w:r>
+              <w:t xml:space="preserve"> </w:t>
+            </w:r>
+            <w:r>
+              <w:rPr>
+                <w:rStyle w:val="VerbatimChar"/>
+              </w:rPr>
+              <w:t xml:space="preserve">gif</w:t>
+            </w:r>
+            <w:r>
+              <w:t xml:space="preserve"> </w:t>
+            </w:r>
+            <w:r>
+              <w:t xml:space="preserve">|</w:t>
+            </w:r>
+            <w:r>
+              <w:t xml:space="preserve"> </w:t>
+            </w:r>
+            <w:r>
+              <w:rPr>
+                <w:rStyle w:val="VerbatimChar"/>
+              </w:rPr>
+              <w:t xml:space="preserve">svga</w:t>
+            </w:r>
+            <w:r>
+              <w:t xml:space="preserve"> </w:t>
+            </w:r>
+            <w:r>
+              <w:t xml:space="preserve">|</w:t>
+            </w:r>
+            <w:r>
+              <w:t xml:space="preserve"> </w:t>
+            </w:r>
+            <w:r>
+              <w:rPr>
+                <w:rStyle w:val="VerbatimChar"/>
+              </w:rPr>
+              <w:t xml:space="preserve">lottie</w:t>
+            </w:r>
+            <w:r>
+              <w:t xml:space="preserve"> </w:t>
+            </w:r>
+            <w:r>
+              <w:t xml:space="preserve">|</w:t>
+            </w:r>
+            <w:r>
+              <w:t xml:space="preserve"> </w:t>
+            </w:r>
+            <w:r>
+              <w:rPr>
+                <w:rStyle w:val="VerbatimChar"/>
+              </w:rPr>
+              <w:t xml:space="preserve">mp4</w:t>
+            </w:r>
+            <w:r>
+              <w:t xml:space="preserve"> </w:t>
+            </w:r>
+            <w:r>
+              <w:t xml:space="preserve">|</w:t>
+            </w:r>
+            <w:r>
+              <w:t xml:space="preserve"> </w:t>
+            </w:r>
+            <w:r>
+              <w:rPr>
+                <w:rStyle w:val="VerbatimChar"/>
+              </w:rPr>
+              <w:t xml:space="preserve">webm</w:t>
+            </w:r>
+            <w:r>
+              <w:t xml:space="preserve">. Oynatıcı seçimini</w:t>
+            </w:r>
+            <w:r>
+              <w:t xml:space="preserve"> </w:t>
+            </w:r>
+            <w:r>
+              <w:rPr>
+                <w:bCs/>
+                <w:b/>
+              </w:rPr>
+              <w:t xml:space="preserve">buna göre</w:t>
+            </w:r>
+            <w:r>
+              <w:t xml:space="preserve"> </w:t>
+            </w:r>
+            <w:r>
+              <w:t xml:space="preserve">yap</w:t>
+            </w:r>
+          </w:p>
+        </w:tc>
+      </w:tr>
+      <w:tr>
+        <w:tc>
+          <w:tcPr/>
+          <w:p>
+            <w:pPr>
+              <w:pStyle w:val="Compact"/>
+              <w:jc w:val="left"/>
+            </w:pPr>
+            <w:r>
+              <w:rPr>
+                <w:rStyle w:val="VerbatimChar"/>
+              </w:rPr>
+              <w:t xml:space="preserve">imageUrl</w:t>
+            </w:r>
+          </w:p>
+        </w:tc>
+        <w:tc>
+          <w:tcPr/>
+          <w:p>
+            <w:pPr>
+              <w:pStyle w:val="Compact"/>
+              <w:jc w:val="left"/>
+            </w:pPr>
+            <w:r>
+              <w:t xml:space="preserve">string?</w:t>
+            </w:r>
+          </w:p>
+        </w:tc>
+        <w:tc>
+          <w:tcPr/>
+          <w:p>
+            <w:pPr>
+              <w:pStyle w:val="Compact"/>
+              <w:jc w:val="left"/>
+            </w:pPr>
+            <w:r>
+              <w:t xml:space="preserve">Resim/animasyon asset URL’i (png/gif/webp/lottie/svga)</w:t>
+            </w:r>
+          </w:p>
+        </w:tc>
+      </w:tr>
+      <w:tr>
+        <w:tc>
+          <w:tcPr/>
+          <w:p>
+            <w:pPr>
+              <w:pStyle w:val="Compact"/>
+              <w:jc w:val="left"/>
+            </w:pPr>
+            <w:r>
+              <w:rPr>
+                <w:rStyle w:val="VerbatimChar"/>
+              </w:rPr>
+              <w:t xml:space="preserve">videoUrl</w:t>
+            </w:r>
+          </w:p>
+        </w:tc>
+        <w:tc>
+          <w:tcPr/>
+          <w:p>
+            <w:pPr>
+              <w:pStyle w:val="Compact"/>
+              <w:jc w:val="left"/>
+            </w:pPr>
+            <w:r>
+              <w:t xml:space="preserve">string?</w:t>
+            </w:r>
+          </w:p>
+        </w:tc>
+        <w:tc>
+          <w:tcPr/>
+          <w:p>
+            <w:pPr>
+              <w:pStyle w:val="Compact"/>
+              <w:jc w:val="left"/>
+            </w:pPr>
+            <w:r>
+              <w:t xml:space="preserve">Yalnızca</w:t>
+            </w:r>
+            <w:r>
+              <w:t xml:space="preserve"> </w:t>
+            </w:r>
+            <w:r>
+              <w:rPr>
+                <w:rStyle w:val="VerbatimChar"/>
+              </w:rPr>
+              <w:t xml:space="preserve">mp4</w:t>
+            </w:r>
+            <w:r>
+              <w:t xml:space="preserve">/</w:t>
+            </w:r>
+            <w:r>
+              <w:rPr>
+                <w:rStyle w:val="VerbatimChar"/>
+              </w:rPr>
+              <w:t xml:space="preserve">webm</w:t>
+            </w:r>
+            <w:r>
+              <w:t xml:space="preserve"> </w:t>
+            </w:r>
+            <w:r>
+              <w:t xml:space="preserve">için video URL’i</w:t>
+            </w:r>
+          </w:p>
+        </w:tc>
+      </w:tr>
+      <w:tr>
+        <w:tc>
+          <w:tcPr/>
+          <w:p>
+            <w:pPr>
+              <w:pStyle w:val="Compact"/>
+              <w:jc w:val="left"/>
+            </w:pPr>
+            <w:r>
+              <w:rPr>
+                <w:rStyle w:val="VerbatimChar"/>
+              </w:rPr>
+              <w:t xml:space="preserve">thumbnailUrl</w:t>
+            </w:r>
+          </w:p>
+        </w:tc>
+        <w:tc>
+          <w:tcPr/>
+          <w:p>
+            <w:pPr>
+              <w:pStyle w:val="Compact"/>
+              <w:jc w:val="left"/>
+            </w:pPr>
+            <w:r>
+              <w:t xml:space="preserve">string?</w:t>
+            </w:r>
+          </w:p>
+        </w:tc>
+        <w:tc>
+          <w:tcPr/>
+          <w:p>
+            <w:pPr>
+              <w:pStyle w:val="Compact"/>
+              <w:jc w:val="left"/>
+            </w:pPr>
+            <w:r>
+              <w:t xml:space="preserve">Küçük önizleme/placeholder (precache + video poster)</w:t>
+            </w:r>
+          </w:p>
+        </w:tc>
+      </w:tr>
+      <w:tr>
+        <w:tc>
+          <w:tcPr/>
+          <w:p>
+            <w:pPr>
+              <w:pStyle w:val="Compact"/>
+              <w:jc w:val="left"/>
+            </w:pPr>
+            <w:r>
+              <w:rPr>
+                <w:rStyle w:val="VerbatimChar"/>
+              </w:rPr>
+              <w:t xml:space="preserve">animationType</w:t>
+            </w:r>
+          </w:p>
+        </w:tc>
+        <w:tc>
+          <w:tcPr/>
+          <w:p>
+            <w:pPr>
+              <w:pStyle w:val="Compact"/>
+              <w:jc w:val="left"/>
+            </w:pPr>
+            <w:r>
+              <w:t xml:space="preserve">string?</w:t>
+            </w:r>
+          </w:p>
+        </w:tc>
+        <w:tc>
+          <w:tcPr/>
+          <w:p>
+            <w:pPr>
+              <w:pStyle w:val="Compact"/>
+              <w:jc w:val="left"/>
+            </w:pPr>
+            <w:r>
+              <w:t xml:space="preserve">Animasyon tipi/isim (</w:t>
+            </w:r>
+            <w:r>
+              <w:rPr>
+                <w:rStyle w:val="VerbatimChar"/>
+              </w:rPr>
+              <w:t xml:space="preserve">giftType.animation</w:t>
+            </w:r>
+            <w:r>
+              <w:t xml:space="preserve"> </w:t>
+            </w:r>
+            <w:r>
+              <w:t xml:space="preserve">??</w:t>
+            </w:r>
+            <w:r>
+              <w:t xml:space="preserve"> </w:t>
+            </w:r>
+            <w:r>
+              <w:rPr>
+                <w:rStyle w:val="VerbatimChar"/>
+              </w:rPr>
+              <w:t xml:space="preserve">displayType</w:t>
+            </w:r>
+            <w:r>
+              <w:t xml:space="preserve">)</w:t>
+            </w:r>
+          </w:p>
+        </w:tc>
+      </w:tr>
+      <w:tr>
+        <w:tc>
+          <w:tcPr/>
+          <w:p>
+            <w:pPr>
+              <w:pStyle w:val="Compact"/>
+              <w:jc w:val="left"/>
+            </w:pPr>
+            <w:r>
+              <w:rPr>
+                <w:rStyle w:val="VerbatimChar"/>
+              </w:rPr>
+              <w:t xml:space="preserve">animationDurationMs</w:t>
+            </w:r>
+          </w:p>
+        </w:tc>
+        <w:tc>
+          <w:tcPr/>
+          <w:p>
+            <w:pPr>
+              <w:pStyle w:val="Compact"/>
+              <w:jc w:val="left"/>
+            </w:pPr>
+            <w:r>
+              <w:t xml:space="preserve">int?</w:t>
+            </w:r>
+          </w:p>
+        </w:tc>
+        <w:tc>
+          <w:tcPr/>
+          <w:p>
+            <w:pPr>
+              <w:pStyle w:val="Compact"/>
+              <w:jc w:val="left"/>
+            </w:pPr>
+            <w:r>
+              <w:t xml:space="preserve">Animasyon süresi (ms)</w:t>
+            </w:r>
+          </w:p>
+        </w:tc>
+      </w:tr>
+      <w:tr>
+        <w:tc>
+          <w:tcPr/>
+          <w:p>
+            <w:pPr>
+              <w:pStyle w:val="Compact"/>
+              <w:jc w:val="left"/>
+            </w:pPr>
+            <w:r>
+              <w:rPr>
+                <w:rStyle w:val="VerbatimChar"/>
+              </w:rPr>
+              <w:t xml:space="preserve">startDelayMs</w:t>
+            </w:r>
+          </w:p>
+        </w:tc>
+        <w:tc>
+          <w:tcPr/>
+          <w:p>
+            <w:pPr>
+              <w:pStyle w:val="Compact"/>
+              <w:jc w:val="left"/>
+            </w:pPr>
+            <w:r>
+              <w:t xml:space="preserve">int?</w:t>
+            </w:r>
+          </w:p>
+        </w:tc>
+        <w:tc>
+          <w:tcPr/>
+          <w:p>
+            <w:pPr>
+              <w:pStyle w:val="Compact"/>
+              <w:jc w:val="left"/>
+            </w:pPr>
+            <w:r>
+              <w:t xml:space="preserve">Başlangıç gecikmesi (ms)</w:t>
+            </w:r>
+          </w:p>
+        </w:tc>
+      </w:tr>
+      <w:tr>
+        <w:tc>
+          <w:tcPr/>
+          <w:p>
+            <w:pPr>
+              <w:pStyle w:val="Compact"/>
+              <w:jc w:val="left"/>
+            </w:pPr>
+            <w:r>
+              <w:rPr>
+                <w:rStyle w:val="VerbatimChar"/>
+              </w:rPr>
+              <w:t xml:space="preserve">effectColor</w:t>
+            </w:r>
+          </w:p>
+        </w:tc>
+        <w:tc>
+          <w:tcPr/>
+          <w:p>
+            <w:pPr>
+              <w:pStyle w:val="Compact"/>
+              <w:jc w:val="left"/>
+            </w:pPr>
+            <w:r>
+              <w:t xml:space="preserve">string?</w:t>
+            </w:r>
+          </w:p>
+        </w:tc>
+        <w:tc>
+          <w:tcPr/>
+          <w:p>
+            <w:pPr>
+              <w:pStyle w:val="Compact"/>
+              <w:jc w:val="left"/>
+            </w:pPr>
+            <w:r>
+              <w:t xml:space="preserve">Efekt/parıltı rengi (opsiyonel)</w:t>
+            </w:r>
+          </w:p>
+        </w:tc>
+      </w:tr>
+      <w:tr>
+        <w:tc>
+          <w:tcPr/>
+          <w:p>
+            <w:pPr>
+              <w:pStyle w:val="Compact"/>
+              <w:jc w:val="left"/>
+            </w:pPr>
+            <w:r>
+              <w:rPr>
+                <w:rStyle w:val="VerbatimChar"/>
+              </w:rPr>
+              <w:t xml:space="preserve">musicUrl</w:t>
+            </w:r>
+          </w:p>
+        </w:tc>
+        <w:tc>
+          <w:tcPr/>
+          <w:p>
+            <w:pPr>
+              <w:pStyle w:val="Compact"/>
+              <w:jc w:val="left"/>
+            </w:pPr>
+            <w:r>
+              <w:t xml:space="preserve">string?</w:t>
+            </w:r>
+          </w:p>
+        </w:tc>
+        <w:tc>
+          <w:tcPr/>
+          <w:p>
+            <w:pPr>
+              <w:pStyle w:val="Compact"/>
+              <w:jc w:val="left"/>
+            </w:pPr>
+            <w:r>
+              <w:t xml:space="preserve">Hediye müziği (opsiyonel)</w:t>
             </w:r>
           </w:p>
         </w:tc>
@@ -6559,8 +7339,3510 @@
         <w:t xml:space="preserve">Tüm iş/finans mantığı backend’de; Flutter sadece bu verileri render eder ve kullanıcı aksiyonlarını bu endpoint’lere iletir.</w:t>
       </w:r>
     </w:p>
+    <w:p>
+      <w:r>
+        <w:pict>
+          <v:rect style="width:0;height:1.5pt" o:hralign="center" o:hrstd="t" o:hr="t"/>
+        </w:pict>
+      </w:r>
+    </w:p>
     <w:bookmarkEnd w:id="44"/>
+    <w:bookmarkStart w:id="54" w:name="X79d9961094cb7cd94088a14d181c2b14104c05a"/>
+    <w:p>
+      <w:pPr>
+        <w:pStyle w:val="Heading2"/>
+      </w:pPr>
+      <w:r>
+        <w:t xml:space="preserve">9. CANLI ODA SİSTEMİ — KRİTİK HATA DÜZELTMELERİ (ZORUNLU)</w:t>
+      </w:r>
+    </w:p>
+    <w:p>
+      <w:pPr>
+        <w:pStyle w:val="BlockText"/>
+      </w:pPr>
+      <w:r>
+        <w:t xml:space="preserve">Bu bölüm</w:t>
+      </w:r>
+      <w:r>
+        <w:t xml:space="preserve"> </w:t>
+      </w:r>
+      <w:r>
+        <w:rPr>
+          <w:bCs/>
+          <w:b/>
+        </w:rPr>
+        <w:t xml:space="preserve">canlı oda</w:t>
+      </w:r>
+      <w:r>
+        <w:t xml:space="preserve"> </w:t>
+      </w:r>
+      <w:r>
+        <w:t xml:space="preserve">(sesli oda + canlı yayın) sistemindeki kritik hataları giderir. Kural:</w:t>
+      </w:r>
+      <w:r>
+        <w:t xml:space="preserve"> </w:t>
+      </w:r>
+      <w:r>
+        <w:rPr>
+          <w:bCs/>
+          <w:b/>
+        </w:rPr>
+        <w:t xml:space="preserve">hiçbir şey lokal çalışmaz</w:t>
+      </w:r>
+      <w:r>
+        <w:t xml:space="preserve"> </w:t>
+      </w:r>
+      <w:r>
+        <w:t xml:space="preserve">— tüm hediye, koltuk ve senkron durumu</w:t>
+      </w:r>
+      <w:r>
+        <w:t xml:space="preserve"> </w:t>
+      </w:r>
+      <w:r>
+        <w:rPr>
+          <w:bCs/>
+          <w:b/>
+        </w:rPr>
+        <w:t xml:space="preserve">backend olaylarından</w:t>
+      </w:r>
+      <w:r>
+        <w:t xml:space="preserve"> </w:t>
+      </w:r>
+      <w:r>
+        <w:t xml:space="preserve">(SSE) sürülür. Flutter yalnızca render eder. Bu bölüm §3 ve §5 ile birlikte uygulanır.</w:t>
+      </w:r>
+    </w:p>
+    <w:bookmarkStart w:id="45" w:name="Xf1aa4c4ed3f7a86a808ea0169f48a6d7fd7ab25"/>
+    <w:p>
+      <w:pPr>
+        <w:pStyle w:val="Heading3"/>
+      </w:pPr>
+      <w:r>
+        <w:t xml:space="preserve">9.1 Hediye senkronizasyonu — animasyon YALNIZCA backend olayıyla başlar</w:t>
+      </w:r>
+    </w:p>
+    <w:p>
+      <w:pPr>
+        <w:pStyle w:val="FirstParagraph"/>
+      </w:pPr>
+      <w:r>
+        <w:rPr>
+          <w:bCs/>
+          <w:b/>
+        </w:rPr>
+        <w:t xml:space="preserve">Backend akış sırası (değiştirilemez):</w:t>
+      </w:r>
+      <w:r>
+        <w:t xml:space="preserve"> </w:t>
+      </w:r>
+      <w:r>
+        <w:t xml:space="preserve">jeton düş →</w:t>
+      </w:r>
+      <w:r>
+        <w:t xml:space="preserve"> </w:t>
+      </w:r>
+      <w:r>
+        <w:rPr>
+          <w:rStyle w:val="VerbatimChar"/>
+        </w:rPr>
+        <w:t xml:space="preserve">GiftTransaction</w:t>
+      </w:r>
+      <w:r>
+        <w:t xml:space="preserve"> </w:t>
+      </w:r>
+      <w:r>
+        <w:t xml:space="preserve">→</w:t>
+      </w:r>
+      <w:r>
+        <w:t xml:space="preserve"> </w:t>
+      </w:r>
+      <w:r>
+        <w:rPr>
+          <w:rStyle w:val="VerbatimChar"/>
+        </w:rPr>
+        <w:t xml:space="preserve">GiftHistory</w:t>
+      </w:r>
+      <w:r>
+        <w:t xml:space="preserve"> </w:t>
+      </w:r>
+      <w:r>
+        <w:t xml:space="preserve">→</w:t>
+      </w:r>
+      <w:r>
+        <w:t xml:space="preserve"> </w:t>
+      </w:r>
+      <w:r>
+        <w:rPr>
+          <w:rStyle w:val="VerbatimChar"/>
+        </w:rPr>
+        <w:t xml:space="preserve">RoomGiftEvent</w:t>
+      </w:r>
+      <w:r>
+        <w:t xml:space="preserve"> </w:t>
+      </w:r>
+      <w:r>
+        <w:t xml:space="preserve">→</w:t>
+      </w:r>
+      <w:r>
+        <w:t xml:space="preserve"> </w:t>
+      </w:r>
+      <w:r>
+        <w:rPr>
+          <w:bCs/>
+          <w:b/>
+        </w:rPr>
+        <w:t xml:space="preserve">SSE ile odadaki/yayındaki HERKESE</w:t>
+      </w:r>
+      <w:r>
+        <w:t xml:space="preserve"> </w:t>
+      </w:r>
+      <w:r>
+        <w:t xml:space="preserve">yayınla. Yani gönderen dahil herkes animasyonu</w:t>
+      </w:r>
+      <w:r>
+        <w:t xml:space="preserve"> </w:t>
+      </w:r>
+      <w:r>
+        <w:rPr>
+          <w:bCs/>
+          <w:b/>
+        </w:rPr>
+        <w:t xml:space="preserve">aynı anda</w:t>
+      </w:r>
+      <w:r>
+        <w:t xml:space="preserve"> </w:t>
+      </w:r>
+      <w:r>
+        <w:t xml:space="preserve">ve aynı SSE olayından görür.</w:t>
+      </w:r>
+    </w:p>
+    <w:p>
+      <w:pPr>
+        <w:pStyle w:val="BodyText"/>
+      </w:pPr>
+      <w:r>
+        <w:rPr>
+          <w:bCs/>
+          <w:b/>
+        </w:rPr>
+        <w:t xml:space="preserve">Flutter kuralları (KESİN):</w:t>
+      </w:r>
+      <w:r>
+        <w:t xml:space="preserve"> </w:t>
+      </w:r>
+      <w:r>
+        <w:t xml:space="preserve">1.</w:t>
+      </w:r>
+      <w:r>
+        <w:t xml:space="preserve"> </w:t>
+      </w:r>
+      <w:r>
+        <w:rPr>
+          <w:bCs/>
+          <w:b/>
+        </w:rPr>
+        <w:t xml:space="preserve">Hediye butonuna basınca lokal animasyon BAŞLATMA.</w:t>
+      </w:r>
+      <w:r>
+        <w:t xml:space="preserve"> </w:t>
+      </w:r>
+      <w:r>
+        <w:t xml:space="preserve">Sadece</w:t>
+      </w:r>
+      <w:r>
+        <w:t xml:space="preserve"> </w:t>
+      </w:r>
+      <w:r>
+        <w:rPr>
+          <w:rStyle w:val="VerbatimChar"/>
+        </w:rPr>
+        <w:t xml:space="preserve">POST /api/live/gift/send</w:t>
+      </w:r>
+      <w:r>
+        <w:t xml:space="preserve"> </w:t>
+      </w:r>
+      <w:r>
+        <w:t xml:space="preserve">(veya ilgili gönderim endpoint’i) çağrılır. Animasyon, o çağrının HTTP yanıtından değil,</w:t>
+      </w:r>
+      <w:r>
+        <w:t xml:space="preserve"> </w:t>
+      </w:r>
+      <w:r>
+        <w:rPr>
+          <w:bCs/>
+          <w:b/>
+        </w:rPr>
+        <w:t xml:space="preserve">SSE</w:t>
+      </w:r>
+      <w:r>
+        <w:rPr>
+          <w:bCs/>
+          <w:b/>
+        </w:rPr>
+        <w:t xml:space="preserve"> </w:t>
+      </w:r>
+      <w:r>
+        <w:rPr>
+          <w:rStyle w:val="VerbatimChar"/>
+          <w:bCs/>
+          <w:b/>
+        </w:rPr>
+        <w:t xml:space="preserve">type:'gift'</w:t>
+      </w:r>
+      <w:r>
+        <w:rPr>
+          <w:bCs/>
+          <w:b/>
+        </w:rPr>
+        <w:t xml:space="preserve"> </w:t>
+      </w:r>
+      <w:r>
+        <w:rPr>
+          <w:bCs/>
+          <w:b/>
+        </w:rPr>
+        <w:t xml:space="preserve">olayı</w:t>
+      </w:r>
+      <w:r>
+        <w:t xml:space="preserve"> </w:t>
+      </w:r>
+      <w:r>
+        <w:t xml:space="preserve">geldiğinde başlar. Böylece gönderenin cihazı da diğerleriyle</w:t>
+      </w:r>
+      <w:r>
+        <w:t xml:space="preserve"> </w:t>
+      </w:r>
+      <w:r>
+        <w:rPr>
+          <w:bCs/>
+          <w:b/>
+        </w:rPr>
+        <w:t xml:space="preserve">birebir aynı anda</w:t>
+      </w:r>
+      <w:r>
+        <w:t xml:space="preserve"> </w:t>
+      </w:r>
+      <w:r>
+        <w:t xml:space="preserve">oynatır.</w:t>
+      </w:r>
+      <w:r>
+        <w:t xml:space="preserve"> </w:t>
+      </w:r>
+      <w:r>
+        <w:t xml:space="preserve">2.</w:t>
+      </w:r>
+      <w:r>
+        <w:t xml:space="preserve"> </w:t>
+      </w:r>
+      <w:r>
+        <w:rPr>
+          <w:bCs/>
+          <w:b/>
+        </w:rPr>
+        <w:t xml:space="preserve">Dedupe (tekilleştirme):</w:t>
+      </w:r>
+      <w:r>
+        <w:t xml:space="preserve"> </w:t>
+      </w:r>
+      <w:r>
+        <w:t xml:space="preserve">Her olayın</w:t>
+      </w:r>
+      <w:r>
+        <w:t xml:space="preserve"> </w:t>
+      </w:r>
+      <w:r>
+        <w:rPr>
+          <w:rStyle w:val="VerbatimChar"/>
+        </w:rPr>
+        <w:t xml:space="preserve">giftId</w:t>
+      </w:r>
+      <w:r>
+        <w:t xml:space="preserve"> </w:t>
+      </w:r>
+      <w:r>
+        <w:t xml:space="preserve">alanı vardır. Gösterilen</w:t>
+      </w:r>
+      <w:r>
+        <w:t xml:space="preserve"> </w:t>
+      </w:r>
+      <w:r>
+        <w:rPr>
+          <w:rStyle w:val="VerbatimChar"/>
+        </w:rPr>
+        <w:t xml:space="preserve">giftId</w:t>
+      </w:r>
+      <w:r>
+        <w:t xml:space="preserve">’leri bir</w:t>
+      </w:r>
+      <w:r>
+        <w:t xml:space="preserve"> </w:t>
+      </w:r>
+      <w:r>
+        <w:rPr>
+          <w:rStyle w:val="VerbatimChar"/>
+        </w:rPr>
+        <w:t xml:space="preserve">Set&lt;String&gt; _shownGiftIds</w:t>
+      </w:r>
+      <w:r>
+        <w:t xml:space="preserve"> </w:t>
+      </w:r>
+      <w:r>
+        <w:t xml:space="preserve">içinde tut; aynı</w:t>
+      </w:r>
+      <w:r>
+        <w:t xml:space="preserve"> </w:t>
+      </w:r>
+      <w:r>
+        <w:rPr>
+          <w:rStyle w:val="VerbatimChar"/>
+        </w:rPr>
+        <w:t xml:space="preserve">giftId</w:t>
+      </w:r>
+      <w:r>
+        <w:t xml:space="preserve"> </w:t>
+      </w:r>
+      <w:r>
+        <w:t xml:space="preserve">tekrar gelirse (reconnect replay vb.)</w:t>
+      </w:r>
+      <w:r>
+        <w:t xml:space="preserve"> </w:t>
+      </w:r>
+      <w:r>
+        <w:rPr>
+          <w:bCs/>
+          <w:b/>
+        </w:rPr>
+        <w:t xml:space="preserve">yeniden oynatma</w:t>
+      </w:r>
+      <w:r>
+        <w:t xml:space="preserve">.</w:t>
+      </w:r>
+      <w:r>
+        <w:t xml:space="preserve"> </w:t>
+      </w:r>
+      <w:r>
+        <w:t xml:space="preserve">3.</w:t>
+      </w:r>
+      <w:r>
+        <w:t xml:space="preserve"> </w:t>
+      </w:r>
+      <w:r>
+        <w:rPr>
+          <w:bCs/>
+          <w:b/>
+        </w:rPr>
+        <w:t xml:space="preserve">Geç bağlananlar eski hediyeyi GÖRMEZ:</w:t>
+      </w:r>
+      <w:r>
+        <w:t xml:space="preserve"> </w:t>
+      </w:r>
+      <w:r>
+        <w:t xml:space="preserve">Odaya/yayına girerken</w:t>
+      </w:r>
+      <w:r>
+        <w:t xml:space="preserve"> </w:t>
+      </w:r>
+      <w:r>
+        <w:rPr>
+          <w:rStyle w:val="VerbatimChar"/>
+        </w:rPr>
+        <w:t xml:space="preserve">joinTimestamp = DateTime.now().millisecondsSinceEpoch</w:t>
+      </w:r>
+      <w:r>
+        <w:t xml:space="preserve"> </w:t>
+      </w:r>
+      <w:r>
+        <w:t xml:space="preserve">sakla. Gelen</w:t>
+      </w:r>
+      <w:r>
+        <w:t xml:space="preserve"> </w:t>
+      </w:r>
+      <w:r>
+        <w:rPr>
+          <w:rStyle w:val="VerbatimChar"/>
+        </w:rPr>
+        <w:t xml:space="preserve">gift</w:t>
+      </w:r>
+      <w:r>
+        <w:t xml:space="preserve"> </w:t>
+      </w:r>
+      <w:r>
+        <w:t xml:space="preserve">olayında</w:t>
+      </w:r>
+      <w:r>
+        <w:t xml:space="preserve"> </w:t>
+      </w:r>
+      <w:r>
+        <w:rPr>
+          <w:rStyle w:val="VerbatimChar"/>
+        </w:rPr>
+        <w:t xml:space="preserve">event.timestamp &lt; joinTimestamp</w:t>
+      </w:r>
+      <w:r>
+        <w:t xml:space="preserve"> </w:t>
+      </w:r>
+      <w:r>
+        <w:t xml:space="preserve">ise</w:t>
+      </w:r>
+      <w:r>
+        <w:t xml:space="preserve"> </w:t>
+      </w:r>
+      <w:r>
+        <w:rPr>
+          <w:bCs/>
+          <w:b/>
+        </w:rPr>
+        <w:t xml:space="preserve">animasyonu atla</w:t>
+      </w:r>
+      <w:r>
+        <w:t xml:space="preserve"> </w:t>
+      </w:r>
+      <w:r>
+        <w:t xml:space="preserve">(yalnızca gönderen paneli/sayaç için sessizce kullanılabilir, ama tam ekran/koltuk animasyonu oynatılmaz). Late-joiner asla eski hediye animasyonu görmez.</w:t>
+      </w:r>
+      <w:r>
+        <w:t xml:space="preserve"> </w:t>
+      </w:r>
+      <w:r>
+        <w:t xml:space="preserve">4.</w:t>
+      </w:r>
+      <w:r>
+        <w:t xml:space="preserve"> </w:t>
+      </w:r>
+      <w:r>
+        <w:rPr>
+          <w:rStyle w:val="VerbatimChar"/>
+          <w:bCs/>
+          <w:b/>
+        </w:rPr>
+        <w:t xml:space="preserve">GET .../gifts</w:t>
+      </w:r>
+      <w:r>
+        <w:rPr>
+          <w:bCs/>
+          <w:b/>
+        </w:rPr>
+        <w:t xml:space="preserve"> </w:t>
+      </w:r>
+      <w:r>
+        <w:rPr>
+          <w:bCs/>
+          <w:b/>
+        </w:rPr>
+        <w:t xml:space="preserve">(recentGifts) ile ASLA animasyon başlatma.</w:t>
+      </w:r>
+      <w:r>
+        <w:t xml:space="preserve"> </w:t>
+      </w:r>
+      <w:r>
+        <w:t xml:space="preserve">O endpoint yalnızca</w:t>
+      </w:r>
+      <w:r>
+        <w:t xml:space="preserve"> </w:t>
+      </w:r>
+      <w:r>
+        <w:t xml:space="preserve">“</w:t>
+      </w:r>
+      <w:r>
+        <w:t xml:space="preserve">gönderenler paneli</w:t>
+      </w:r>
+      <w:r>
+        <w:t xml:space="preserve">”</w:t>
+      </w:r>
+      <w:r>
+        <w:t xml:space="preserve"> </w:t>
+      </w:r>
+      <w:r>
+        <w:t xml:space="preserve">ve lider tablosu içindir. Animasyonun</w:t>
+      </w:r>
+      <w:r>
+        <w:t xml:space="preserve"> </w:t>
+      </w:r>
+      <w:r>
+        <w:rPr>
+          <w:bCs/>
+          <w:b/>
+        </w:rPr>
+        <w:t xml:space="preserve">tek</w:t>
+      </w:r>
+      <w:r>
+        <w:t xml:space="preserve"> </w:t>
+      </w:r>
+      <w:r>
+        <w:t xml:space="preserve">tetikleyicisi SSE’dir.</w:t>
+      </w:r>
+    </w:p>
+    <w:p>
+      <w:pPr>
+        <w:pStyle w:val="SourceCode"/>
+      </w:pPr>
+      <w:r>
+        <w:rPr>
+          <w:rStyle w:val="VerbatimChar"/>
+        </w:rPr>
+        <w:t xml:space="preserve">final Set&lt;String&gt; _shownGiftIds = {};</w:t>
+      </w:r>
+      <w:r>
+        <w:br/>
+      </w:r>
+      <w:r>
+        <w:rPr>
+          <w:rStyle w:val="VerbatimChar"/>
+        </w:rPr>
+        <w:t xml:space="preserve">late final int _joinTimestamp; // odaya girerken set edilir</w:t>
+      </w:r>
+      <w:r>
+        <w:br/>
+      </w:r>
+      <w:r>
+        <w:br/>
+      </w:r>
+      <w:r>
+        <w:rPr>
+          <w:rStyle w:val="VerbatimChar"/>
+        </w:rPr>
+        <w:t xml:space="preserve">void onSseGift(GiftEvent e) {</w:t>
+      </w:r>
+      <w:r>
+        <w:br/>
+      </w:r>
+      <w:r>
+        <w:rPr>
+          <w:rStyle w:val="VerbatimChar"/>
+        </w:rPr>
+        <w:t xml:space="preserve">  // 1) katılımdan önceki hediyeler animasyon oynatmaz</w:t>
+      </w:r>
+      <w:r>
+        <w:br/>
+      </w:r>
+      <w:r>
+        <w:rPr>
+          <w:rStyle w:val="VerbatimChar"/>
+        </w:rPr>
+        <w:t xml:space="preserve">  if (e.timestamp &lt; _joinTimestamp) { _updateSenderPanelOnly(e); return; }</w:t>
+      </w:r>
+      <w:r>
+        <w:br/>
+      </w:r>
+      <w:r>
+        <w:rPr>
+          <w:rStyle w:val="VerbatimChar"/>
+        </w:rPr>
+        <w:t xml:space="preserve">  // 2) tekilleştir</w:t>
+      </w:r>
+      <w:r>
+        <w:br/>
+      </w:r>
+      <w:r>
+        <w:rPr>
+          <w:rStyle w:val="VerbatimChar"/>
+        </w:rPr>
+        <w:t xml:space="preserve">  if (!_shownGiftIds.add(e.giftId)) return; // zaten oynatıldı</w:t>
+      </w:r>
+      <w:r>
+        <w:br/>
+      </w:r>
+      <w:r>
+        <w:rPr>
+          <w:rStyle w:val="VerbatimChar"/>
+        </w:rPr>
+        <w:t xml:space="preserve">  // 3) animasyonu backend metasına göre oynat (§9.2)</w:t>
+      </w:r>
+      <w:r>
+        <w:br/>
+      </w:r>
+      <w:r>
+        <w:rPr>
+          <w:rStyle w:val="VerbatimChar"/>
+        </w:rPr>
+        <w:t xml:space="preserve">  _playGift(e);</w:t>
+      </w:r>
+      <w:r>
+        <w:br/>
+      </w:r>
+      <w:r>
+        <w:rPr>
+          <w:rStyle w:val="VerbatimChar"/>
+        </w:rPr>
+        <w:t xml:space="preserve">  _updateSenderPanel(e); // §4 gönderen paneli + sayaç</w:t>
+      </w:r>
+      <w:r>
+        <w:br/>
+      </w:r>
+      <w:r>
+        <w:rPr>
+          <w:rStyle w:val="VerbatimChar"/>
+        </w:rPr>
+        <w:t xml:space="preserve">}</w:t>
+      </w:r>
+    </w:p>
     <w:bookmarkEnd w:id="45"/>
+    <w:bookmarkStart w:id="46" w:name="X68f24d49bc9ce234b68f3294cd8e692a261d371"/>
+    <w:p>
+      <w:pPr>
+        <w:pStyle w:val="Heading3"/>
+      </w:pPr>
+      <w:r>
+        <w:t xml:space="preserve">9.2 Video/animasyonlu hediyeler —</w:t>
+      </w:r>
+      <w:r>
+        <w:t xml:space="preserve"> </w:t>
+      </w:r>
+      <w:r>
+        <w:rPr>
+          <w:rStyle w:val="VerbatimChar"/>
+        </w:rPr>
+        <w:t xml:space="preserve">assetFormat</w:t>
+      </w:r>
+      <w:r>
+        <w:t xml:space="preserve">’a göre oynatıcı seç</w:t>
+      </w:r>
+    </w:p>
+    <w:p>
+      <w:pPr>
+        <w:pStyle w:val="FirstParagraph"/>
+      </w:pPr>
+      <w:r>
+        <w:t xml:space="preserve">Backend artık</w:t>
+      </w:r>
+      <w:r>
+        <w:t xml:space="preserve"> </w:t>
+      </w:r>
+      <w:r>
+        <w:rPr>
+          <w:bCs/>
+          <w:b/>
+        </w:rPr>
+        <w:t xml:space="preserve">kesin format</w:t>
+      </w:r>
+      <w:r>
+        <w:t xml:space="preserve">ı</w:t>
+      </w:r>
+      <w:r>
+        <w:t xml:space="preserve"> </w:t>
+      </w:r>
+      <w:r>
+        <w:rPr>
+          <w:rStyle w:val="VerbatimChar"/>
+        </w:rPr>
+        <w:t xml:space="preserve">assetFormat</w:t>
+      </w:r>
+      <w:r>
+        <w:t xml:space="preserve"> </w:t>
+      </w:r>
+      <w:r>
+        <w:t xml:space="preserve">ile gönderiyor. Oynatıcıyı</w:t>
+      </w:r>
+      <w:r>
+        <w:t xml:space="preserve"> </w:t>
+      </w:r>
+      <w:r>
+        <w:rPr>
+          <w:bCs/>
+          <w:b/>
+        </w:rPr>
+        <w:t xml:space="preserve">buna göre</w:t>
+      </w:r>
+      <w:r>
+        <w:t xml:space="preserve"> </w:t>
+      </w:r>
+      <w:r>
+        <w:t xml:space="preserve">seç (assetType değil,</w:t>
+      </w:r>
+      <w:r>
+        <w:t xml:space="preserve"> </w:t>
+      </w:r>
+      <w:r>
+        <w:rPr>
+          <w:rStyle w:val="VerbatimChar"/>
+        </w:rPr>
+        <w:t xml:space="preserve">assetFormat</w:t>
+      </w:r>
+      <w:r>
+        <w:t xml:space="preserve"> </w:t>
+      </w:r>
+      <w:r>
+        <w:t xml:space="preserve">esas):</w:t>
+      </w:r>
+    </w:p>
+    <w:tbl>
+      <w:tblPr>
+        <w:tblStyle w:val="Table"/>
+        <w:tblW w:type="pct" w:w="5000"/>
+        <w:tblLook w:firstRow="1" w:lastRow="0" w:firstColumn="0" w:lastColumn="0" w:noHBand="0" w:noVBand="0" w:val="0020"/>
+      </w:tblPr>
+      <w:tblGrid>
+        <w:gridCol w:w="3960"/>
+        <w:gridCol w:w="3960"/>
+      </w:tblGrid>
+      <w:tr>
+        <w:trPr>
+          <w:tblHeader w:val="true"/>
+        </w:trPr>
+        <w:tc>
+          <w:tcPr/>
+          <w:p>
+            <w:pPr>
+              <w:pStyle w:val="Compact"/>
+              <w:jc w:val="left"/>
+            </w:pPr>
+            <w:r>
+              <w:rPr>
+                <w:rStyle w:val="VerbatimChar"/>
+              </w:rPr>
+              <w:t xml:space="preserve">assetFormat</w:t>
+            </w:r>
+          </w:p>
+        </w:tc>
+        <w:tc>
+          <w:tcPr/>
+          <w:p>
+            <w:pPr>
+              <w:pStyle w:val="Compact"/>
+              <w:jc w:val="left"/>
+            </w:pPr>
+            <w:r>
+              <w:t xml:space="preserve">Flutter oynatıcı</w:t>
+            </w:r>
+          </w:p>
+        </w:tc>
+      </w:tr>
+      <w:tr>
+        <w:tc>
+          <w:tcPr/>
+          <w:p>
+            <w:pPr>
+              <w:pStyle w:val="Compact"/>
+              <w:jc w:val="left"/>
+            </w:pPr>
+            <w:r>
+              <w:rPr>
+                <w:rStyle w:val="VerbatimChar"/>
+              </w:rPr>
+              <w:t xml:space="preserve">png</w:t>
+            </w:r>
+            <w:r>
+              <w:t xml:space="preserve"> </w:t>
+            </w:r>
+            <w:r>
+              <w:t xml:space="preserve">/</w:t>
+            </w:r>
+            <w:r>
+              <w:t xml:space="preserve"> </w:t>
+            </w:r>
+            <w:r>
+              <w:rPr>
+                <w:rStyle w:val="VerbatimChar"/>
+              </w:rPr>
+              <w:t xml:space="preserve">jpeg</w:t>
+            </w:r>
+            <w:r>
+              <w:t xml:space="preserve"> </w:t>
+            </w:r>
+            <w:r>
+              <w:t xml:space="preserve">/</w:t>
+            </w:r>
+            <w:r>
+              <w:t xml:space="preserve"> </w:t>
+            </w:r>
+            <w:r>
+              <w:rPr>
+                <w:rStyle w:val="VerbatimChar"/>
+              </w:rPr>
+              <w:t xml:space="preserve">webp</w:t>
+            </w:r>
+            <w:r>
+              <w:t xml:space="preserve"> </w:t>
+            </w:r>
+            <w:r>
+              <w:t xml:space="preserve">/</w:t>
+            </w:r>
+            <w:r>
+              <w:t xml:space="preserve"> </w:t>
+            </w:r>
+            <w:r>
+              <w:rPr>
+                <w:rStyle w:val="VerbatimChar"/>
+              </w:rPr>
+              <w:t xml:space="preserve">avif</w:t>
+            </w:r>
+          </w:p>
+        </w:tc>
+        <w:tc>
+          <w:tcPr/>
+          <w:p>
+            <w:pPr>
+              <w:pStyle w:val="Compact"/>
+              <w:jc w:val="left"/>
+            </w:pPr>
+            <w:r>
+              <w:rPr>
+                <w:rStyle w:val="VerbatimChar"/>
+              </w:rPr>
+              <w:t xml:space="preserve">CachedNetworkImage</w:t>
+            </w:r>
+            <w:r>
+              <w:t xml:space="preserve"> </w:t>
+            </w:r>
+            <w:r>
+              <w:t xml:space="preserve">(</w:t>
+            </w:r>
+            <w:r>
+              <w:rPr>
+                <w:rStyle w:val="VerbatimChar"/>
+              </w:rPr>
+              <w:t xml:space="preserve">imageUrl</w:t>
+            </w:r>
+            <w:r>
+              <w:t xml:space="preserve">)</w:t>
+            </w:r>
+          </w:p>
+        </w:tc>
+      </w:tr>
+      <w:tr>
+        <w:tc>
+          <w:tcPr/>
+          <w:p>
+            <w:pPr>
+              <w:pStyle w:val="Compact"/>
+              <w:jc w:val="left"/>
+            </w:pPr>
+            <w:r>
+              <w:rPr>
+                <w:rStyle w:val="VerbatimChar"/>
+              </w:rPr>
+              <w:t xml:space="preserve">gif</w:t>
+            </w:r>
+          </w:p>
+        </w:tc>
+        <w:tc>
+          <w:tcPr/>
+          <w:p>
+            <w:pPr>
+              <w:pStyle w:val="Compact"/>
+              <w:jc w:val="left"/>
+            </w:pPr>
+            <w:r>
+              <w:rPr>
+                <w:rStyle w:val="VerbatimChar"/>
+              </w:rPr>
+              <w:t xml:space="preserve">Image.network</w:t>
+            </w:r>
+            <w:r>
+              <w:t xml:space="preserve"> </w:t>
+            </w:r>
+            <w:r>
+              <w:rPr>
+                <w:bCs/>
+                <w:b/>
+              </w:rPr>
+              <w:t xml:space="preserve">veya</w:t>
+            </w:r>
+            <w:r>
+              <w:t xml:space="preserve"> </w:t>
+            </w:r>
+            <w:r>
+              <w:rPr>
+                <w:rStyle w:val="VerbatimChar"/>
+              </w:rPr>
+              <w:t xml:space="preserve">CachedNetworkImage</w:t>
+            </w:r>
+            <w:r>
+              <w:t xml:space="preserve"> </w:t>
+            </w:r>
+            <w:r>
+              <w:t xml:space="preserve">(</w:t>
+            </w:r>
+            <w:r>
+              <w:rPr>
+                <w:rStyle w:val="VerbatimChar"/>
+              </w:rPr>
+              <w:t xml:space="preserve">imageUrl</w:t>
+            </w:r>
+            <w:r>
+              <w:t xml:space="preserve">)</w:t>
+            </w:r>
+          </w:p>
+        </w:tc>
+      </w:tr>
+      <w:tr>
+        <w:tc>
+          <w:tcPr/>
+          <w:p>
+            <w:pPr>
+              <w:pStyle w:val="Compact"/>
+              <w:jc w:val="left"/>
+            </w:pPr>
+            <w:r>
+              <w:rPr>
+                <w:rStyle w:val="VerbatimChar"/>
+              </w:rPr>
+              <w:t xml:space="preserve">svga</w:t>
+            </w:r>
+          </w:p>
+        </w:tc>
+        <w:tc>
+          <w:tcPr/>
+          <w:p>
+            <w:pPr>
+              <w:pStyle w:val="Compact"/>
+              <w:jc w:val="left"/>
+            </w:pPr>
+            <w:r>
+              <w:rPr>
+                <w:rStyle w:val="VerbatimChar"/>
+              </w:rPr>
+              <w:t xml:space="preserve">svga</w:t>
+            </w:r>
+            <w:r>
+              <w:t xml:space="preserve"> </w:t>
+            </w:r>
+            <w:r>
+              <w:t xml:space="preserve">/</w:t>
+            </w:r>
+            <w:r>
+              <w:t xml:space="preserve"> </w:t>
+            </w:r>
+            <w:r>
+              <w:rPr>
+                <w:rStyle w:val="VerbatimChar"/>
+              </w:rPr>
+              <w:t xml:space="preserve">svgaplayer_flutter</w:t>
+            </w:r>
+            <w:r>
+              <w:t xml:space="preserve"> </w:t>
+            </w:r>
+            <w:r>
+              <w:t xml:space="preserve">(</w:t>
+            </w:r>
+            <w:r>
+              <w:rPr>
+                <w:rStyle w:val="VerbatimChar"/>
+              </w:rPr>
+              <w:t xml:space="preserve">imageUrl</w:t>
+            </w:r>
+            <w:r>
+              <w:t xml:space="preserve">)</w:t>
+            </w:r>
+          </w:p>
+        </w:tc>
+      </w:tr>
+      <w:tr>
+        <w:tc>
+          <w:tcPr/>
+          <w:p>
+            <w:pPr>
+              <w:pStyle w:val="Compact"/>
+              <w:jc w:val="left"/>
+            </w:pPr>
+            <w:r>
+              <w:rPr>
+                <w:rStyle w:val="VerbatimChar"/>
+              </w:rPr>
+              <w:t xml:space="preserve">lottie</w:t>
+            </w:r>
+          </w:p>
+        </w:tc>
+        <w:tc>
+          <w:tcPr/>
+          <w:p>
+            <w:pPr>
+              <w:pStyle w:val="Compact"/>
+              <w:jc w:val="left"/>
+            </w:pPr>
+            <w:r>
+              <w:rPr>
+                <w:rStyle w:val="VerbatimChar"/>
+              </w:rPr>
+              <w:t xml:space="preserve">lottie</w:t>
+            </w:r>
+            <w:r>
+              <w:t xml:space="preserve"> </w:t>
+            </w:r>
+            <w:r>
+              <w:t xml:space="preserve">paketi (</w:t>
+            </w:r>
+            <w:r>
+              <w:rPr>
+                <w:rStyle w:val="VerbatimChar"/>
+              </w:rPr>
+              <w:t xml:space="preserve">imageUrl</w:t>
+            </w:r>
+            <w:r>
+              <w:t xml:space="preserve">)</w:t>
+            </w:r>
+          </w:p>
+        </w:tc>
+      </w:tr>
+      <w:tr>
+        <w:tc>
+          <w:tcPr/>
+          <w:p>
+            <w:pPr>
+              <w:pStyle w:val="Compact"/>
+              <w:jc w:val="left"/>
+            </w:pPr>
+            <w:r>
+              <w:rPr>
+                <w:rStyle w:val="VerbatimChar"/>
+              </w:rPr>
+              <w:t xml:space="preserve">mp4</w:t>
+            </w:r>
+            <w:r>
+              <w:t xml:space="preserve"> </w:t>
+            </w:r>
+            <w:r>
+              <w:t xml:space="preserve">/</w:t>
+            </w:r>
+            <w:r>
+              <w:t xml:space="preserve"> </w:t>
+            </w:r>
+            <w:r>
+              <w:rPr>
+                <w:rStyle w:val="VerbatimChar"/>
+              </w:rPr>
+              <w:t xml:space="preserve">webm</w:t>
+            </w:r>
+          </w:p>
+        </w:tc>
+        <w:tc>
+          <w:tcPr/>
+          <w:p>
+            <w:pPr>
+              <w:pStyle w:val="Compact"/>
+              <w:jc w:val="left"/>
+            </w:pPr>
+            <w:r>
+              <w:rPr>
+                <w:rStyle w:val="VerbatimChar"/>
+              </w:rPr>
+              <w:t xml:space="preserve">video_player</w:t>
+            </w:r>
+            <w:r>
+              <w:t xml:space="preserve"> </w:t>
+            </w:r>
+            <w:r>
+              <w:t xml:space="preserve">(</w:t>
+            </w:r>
+            <w:r>
+              <w:rPr>
+                <w:rStyle w:val="VerbatimChar"/>
+              </w:rPr>
+              <w:t xml:space="preserve">videoUrl</w:t>
+            </w:r>
+            <w:r>
+              <w:t xml:space="preserve">) —</w:t>
+            </w:r>
+            <w:r>
+              <w:t xml:space="preserve"> </w:t>
+            </w:r>
+            <w:r>
+              <w:rPr>
+                <w:bCs/>
+                <w:b/>
+              </w:rPr>
+              <w:t xml:space="preserve">preload + oynat + bitince dispose</w:t>
+            </w:r>
+          </w:p>
+        </w:tc>
+      </w:tr>
+    </w:tbl>
+    <w:p>
+      <w:pPr>
+        <w:pStyle w:val="BodyText"/>
+      </w:pPr>
+      <w:r>
+        <w:rPr>
+          <w:bCs/>
+          <w:b/>
+        </w:rPr>
+        <w:t xml:space="preserve">Video kuralları (bellek sızıntısı yok):</w:t>
+      </w:r>
+    </w:p>
+    <w:p>
+      <w:pPr>
+        <w:pStyle w:val="SourceCode"/>
+      </w:pPr>
+      <w:r>
+        <w:rPr>
+          <w:rStyle w:val="VerbatimChar"/>
+        </w:rPr>
+        <w:t xml:space="preserve">Future&lt;void&gt; _playVideoGift(GiftEvent e) async {</w:t>
+      </w:r>
+      <w:r>
+        <w:br/>
+      </w:r>
+      <w:r>
+        <w:rPr>
+          <w:rStyle w:val="VerbatimChar"/>
+        </w:rPr>
+        <w:t xml:space="preserve">  final controller = VideoPlayerController.networkUrl(Uri.parse(e.videoUrl!));</w:t>
+      </w:r>
+      <w:r>
+        <w:br/>
+      </w:r>
+      <w:r>
+        <w:rPr>
+          <w:rStyle w:val="VerbatimChar"/>
+        </w:rPr>
+        <w:t xml:space="preserve">  await controller.initialize();          // preload</w:t>
+      </w:r>
+      <w:r>
+        <w:br/>
+      </w:r>
+      <w:r>
+        <w:rPr>
+          <w:rStyle w:val="VerbatimChar"/>
+        </w:rPr>
+        <w:t xml:space="preserve">  controller.setLooping(false);</w:t>
+      </w:r>
+      <w:r>
+        <w:br/>
+      </w:r>
+      <w:r>
+        <w:rPr>
+          <w:rStyle w:val="VerbatimChar"/>
+        </w:rPr>
+        <w:t xml:space="preserve">  await controller.play();</w:t>
+      </w:r>
+      <w:r>
+        <w:br/>
+      </w:r>
+      <w:r>
+        <w:rPr>
+          <w:rStyle w:val="VerbatimChar"/>
+        </w:rPr>
+        <w:t xml:space="preserve">  controller.addListener(() async {</w:t>
+      </w:r>
+      <w:r>
+        <w:br/>
+      </w:r>
+      <w:r>
+        <w:rPr>
+          <w:rStyle w:val="VerbatimChar"/>
+        </w:rPr>
+        <w:t xml:space="preserve">    if (controller.value.position &gt;= controller.value.duration) {</w:t>
+      </w:r>
+      <w:r>
+        <w:br/>
+      </w:r>
+      <w:r>
+        <w:rPr>
+          <w:rStyle w:val="VerbatimChar"/>
+        </w:rPr>
+        <w:t xml:space="preserve">      await controller.pause();</w:t>
+      </w:r>
+      <w:r>
+        <w:br/>
+      </w:r>
+      <w:r>
+        <w:rPr>
+          <w:rStyle w:val="VerbatimChar"/>
+        </w:rPr>
+        <w:t xml:space="preserve">      await controller.dispose();          // bitince MUTLAKA dispose — bellekte tutma</w:t>
+      </w:r>
+      <w:r>
+        <w:br/>
+      </w:r>
+      <w:r>
+        <w:rPr>
+          <w:rStyle w:val="VerbatimChar"/>
+        </w:rPr>
+        <w:t xml:space="preserve">      _removeOverlay(e.giftId);</w:t>
+      </w:r>
+      <w:r>
+        <w:br/>
+      </w:r>
+      <w:r>
+        <w:rPr>
+          <w:rStyle w:val="VerbatimChar"/>
+        </w:rPr>
+        <w:t xml:space="preserve">    }</w:t>
+      </w:r>
+      <w:r>
+        <w:br/>
+      </w:r>
+      <w:r>
+        <w:rPr>
+          <w:rStyle w:val="VerbatimChar"/>
+        </w:rPr>
+        <w:t xml:space="preserve">  });</w:t>
+      </w:r>
+      <w:r>
+        <w:br/>
+      </w:r>
+      <w:r>
+        <w:rPr>
+          <w:rStyle w:val="VerbatimChar"/>
+        </w:rPr>
+        <w:t xml:space="preserve">}</w:t>
+      </w:r>
+    </w:p>
+    <w:p>
+      <w:pPr>
+        <w:numPr>
+          <w:ilvl w:val="0"/>
+          <w:numId w:val="1013"/>
+        </w:numPr>
+        <w:pStyle w:val="Compact"/>
+      </w:pPr>
+      <w:r>
+        <w:t xml:space="preserve">Aynı anda en fazla 1–2 tam ekran video overlay tut; kuyruk (queue) ile sırala.</w:t>
+      </w:r>
+    </w:p>
+    <w:p>
+      <w:pPr>
+        <w:numPr>
+          <w:ilvl w:val="0"/>
+          <w:numId w:val="1013"/>
+        </w:numPr>
+        <w:pStyle w:val="Compact"/>
+      </w:pPr>
+      <w:r>
+        <w:rPr>
+          <w:rStyle w:val="VerbatimChar"/>
+        </w:rPr>
+        <w:t xml:space="preserve">thumbnailUrl</w:t>
+      </w:r>
+      <w:r>
+        <w:t xml:space="preserve"> </w:t>
+      </w:r>
+      <w:r>
+        <w:t xml:space="preserve">varsa video hazırlanana kadar poster olarak göster (siyah ekran olmasın).</w:t>
+      </w:r>
+    </w:p>
+    <w:p>
+      <w:pPr>
+        <w:numPr>
+          <w:ilvl w:val="0"/>
+          <w:numId w:val="1013"/>
+        </w:numPr>
+        <w:pStyle w:val="Compact"/>
+      </w:pPr>
+      <w:r>
+        <w:t xml:space="preserve">Tam ekran / koltuk-altı / küçük yerleşim kuralları</w:t>
+      </w:r>
+      <w:r>
+        <w:t xml:space="preserve"> </w:t>
+      </w:r>
+      <w:r>
+        <w:rPr>
+          <w:bCs/>
+          <w:b/>
+        </w:rPr>
+        <w:t xml:space="preserve">§3.3</w:t>
+      </w:r>
+      <w:r>
+        <w:t xml:space="preserve"> </w:t>
+      </w:r>
+      <w:r>
+        <w:t xml:space="preserve">ile aynıdır; yalnızca oynatıcı seçimi</w:t>
+      </w:r>
+      <w:r>
+        <w:t xml:space="preserve"> </w:t>
+      </w:r>
+      <w:r>
+        <w:rPr>
+          <w:rStyle w:val="VerbatimChar"/>
+        </w:rPr>
+        <w:t xml:space="preserve">assetFormat</w:t>
+      </w:r>
+      <w:r>
+        <w:t xml:space="preserve">’a taşınır.</w:t>
+      </w:r>
+    </w:p>
+    <w:bookmarkEnd w:id="46"/>
+    <w:bookmarkStart w:id="47" w:name="jeton-metni-sadece-sayı"/>
+    <w:p>
+      <w:pPr>
+        <w:pStyle w:val="Heading3"/>
+      </w:pPr>
+      <w:r>
+        <w:t xml:space="preserve">9.3 Jeton metni — sadece sayı</w:t>
+      </w:r>
+    </w:p>
+    <w:p>
+      <w:pPr>
+        <w:pStyle w:val="FirstParagraph"/>
+      </w:pPr>
+      <w:r>
+        <w:t xml:space="preserve">Bakiye/jeton gösteriminde</w:t>
+      </w:r>
+      <w:r>
+        <w:t xml:space="preserve"> </w:t>
+      </w:r>
+      <w:r>
+        <w:rPr>
+          <w:bCs/>
+          <w:b/>
+        </w:rPr>
+        <w:t xml:space="preserve">“</w:t>
+      </w:r>
+      <w:r>
+        <w:rPr>
+          <w:bCs/>
+          <w:b/>
+        </w:rPr>
+        <w:t xml:space="preserve">Toplam</w:t>
+      </w:r>
+      <w:r>
+        <w:rPr>
+          <w:bCs/>
+          <w:b/>
+        </w:rPr>
+        <w:t xml:space="preserve">”</w:t>
+      </w:r>
+      <w:r>
+        <w:rPr>
+          <w:bCs/>
+          <w:b/>
+        </w:rPr>
+        <w:t xml:space="preserve"> </w:t>
+      </w:r>
+      <w:r>
+        <w:rPr>
+          <w:bCs/>
+          <w:b/>
+        </w:rPr>
+        <w:t xml:space="preserve">ve</w:t>
+      </w:r>
+      <w:r>
+        <w:rPr>
+          <w:bCs/>
+          <w:b/>
+        </w:rPr>
+        <w:t xml:space="preserve"> </w:t>
+      </w:r>
+      <w:r>
+        <w:rPr>
+          <w:bCs/>
+          <w:b/>
+        </w:rPr>
+        <w:t xml:space="preserve">“</w:t>
+      </w:r>
+      <w:r>
+        <w:rPr>
+          <w:bCs/>
+          <w:b/>
+        </w:rPr>
+        <w:t xml:space="preserve">Jeton</w:t>
+      </w:r>
+      <w:r>
+        <w:rPr>
+          <w:bCs/>
+          <w:b/>
+        </w:rPr>
+        <w:t xml:space="preserve">”</w:t>
+      </w:r>
+      <w:r>
+        <w:rPr>
+          <w:bCs/>
+          <w:b/>
+        </w:rPr>
+        <w:t xml:space="preserve"> </w:t>
+      </w:r>
+      <w:r>
+        <w:rPr>
+          <w:bCs/>
+          <w:b/>
+        </w:rPr>
+        <w:t xml:space="preserve">kelimelerini kaldır</w:t>
+      </w:r>
+      <w:r>
+        <w:t xml:space="preserve">, yalnızca sayıyı göster.</w:t>
+      </w:r>
+      <w:r>
+        <w:t xml:space="preserve"> </w:t>
+      </w:r>
+      <w:r>
+        <w:t xml:space="preserve">-</w:t>
+      </w:r>
+      <w:r>
+        <w:t xml:space="preserve"> </w:t>
+      </w:r>
+      <w:r>
+        <w:rPr>
+          <w:rStyle w:val="VerbatimChar"/>
+          <w:strike/>
+        </w:rPr>
+        <w:t xml:space="preserve">Toplam 999 Jeton</w:t>
+      </w:r>
+      <w:r>
+        <w:t xml:space="preserve"> </w:t>
+      </w:r>
+      <w:r>
+        <w:t xml:space="preserve">→</w:t>
+      </w:r>
+      <w:r>
+        <w:t xml:space="preserve"> </w:t>
+      </w:r>
+      <w:r>
+        <w:rPr>
+          <w:rStyle w:val="VerbatimChar"/>
+          <w:bCs/>
+          <w:b/>
+        </w:rPr>
+        <w:t xml:space="preserve">999</w:t>
+      </w:r>
+      <w:r>
+        <w:t xml:space="preserve"> </w:t>
+      </w:r>
+      <w:r>
+        <w:t xml:space="preserve">(istenirse yanında küçük 💎 ikon).</w:t>
+      </w:r>
+      <w:r>
+        <w:t xml:space="preserve"> </w:t>
+      </w:r>
+      <w:r>
+        <w:t xml:space="preserve">- Bu tüm ekranlarda geçerli (üst bar, cüzdan, hediye gönderim paneli). Sayı formatı: binlik ayraç uygulanabilir (</w:t>
+      </w:r>
+      <w:r>
+        <w:rPr>
+          <w:rStyle w:val="VerbatimChar"/>
+        </w:rPr>
+        <w:t xml:space="preserve">1.250</w:t>
+      </w:r>
+      <w:r>
+        <w:t xml:space="preserve">), ama kelime yok.</w:t>
+      </w:r>
+    </w:p>
+    <w:bookmarkEnd w:id="47"/>
+    <w:bookmarkStart w:id="48" w:name="X1aeaa6a1c704b0ecc73872b982dae9bec441a0e"/>
+    <w:p>
+      <w:pPr>
+        <w:pStyle w:val="Heading3"/>
+      </w:pPr>
+      <w:r>
+        <w:t xml:space="preserve">9.4 Odadan çıkış / yeniden girme (ghost koltuk hatası)</w:t>
+      </w:r>
+    </w:p>
+    <w:p>
+      <w:pPr>
+        <w:pStyle w:val="FirstParagraph"/>
+      </w:pPr>
+      <w:r>
+        <w:rPr>
+          <w:bCs/>
+          <w:b/>
+        </w:rPr>
+        <w:t xml:space="preserve">Hata:</w:t>
+      </w:r>
+      <w:r>
+        <w:t xml:space="preserve"> </w:t>
+      </w:r>
+      <w:r>
+        <w:t xml:space="preserve">çıkıp tekrar girince koltuk boş görünüyor ama oturulamıyordu.</w:t>
+      </w:r>
+      <w:r>
+        <w:t xml:space="preserve"> </w:t>
+      </w:r>
+      <w:r>
+        <w:rPr>
+          <w:bCs/>
+          <w:b/>
+        </w:rPr>
+        <w:t xml:space="preserve">Backend düzeltmesi:</w:t>
+      </w:r>
+      <w:r>
+        <w:t xml:space="preserve"> </w:t>
+      </w:r>
+      <w:r>
+        <w:t xml:space="preserve">koltuk doluluğu artık</w:t>
+      </w:r>
+      <w:r>
+        <w:t xml:space="preserve"> </w:t>
+      </w:r>
+      <w:r>
+        <w:rPr>
+          <w:bCs/>
+          <w:b/>
+        </w:rPr>
+        <w:t xml:space="preserve">kısa</w:t>
+      </w:r>
+      <w:r>
+        <w:rPr>
+          <w:bCs/>
+          <w:b/>
+        </w:rPr>
+        <w:t xml:space="preserve"> </w:t>
+      </w:r>
+      <w:r>
+        <w:rPr>
+          <w:bCs/>
+          <w:b/>
+        </w:rPr>
+        <w:t xml:space="preserve">“</w:t>
+      </w:r>
+      <w:r>
+        <w:rPr>
+          <w:bCs/>
+          <w:b/>
+        </w:rPr>
+        <w:t xml:space="preserve">stale</w:t>
+      </w:r>
+      <w:r>
+        <w:rPr>
+          <w:bCs/>
+          <w:b/>
+        </w:rPr>
+        <w:t xml:space="preserve">”</w:t>
+      </w:r>
+      <w:r>
+        <w:rPr>
+          <w:bCs/>
+          <w:b/>
+        </w:rPr>
+        <w:t xml:space="preserve"> </w:t>
+      </w:r>
+      <w:r>
+        <w:rPr>
+          <w:bCs/>
+          <w:b/>
+        </w:rPr>
+        <w:t xml:space="preserve">penceresi</w:t>
+      </w:r>
+      <w:r>
+        <w:t xml:space="preserve"> </w:t>
+      </w:r>
+      <w:r>
+        <w:t xml:space="preserve">(</w:t>
+      </w:r>
+      <w:r>
+        <w:rPr>
+          <w:rStyle w:val="VerbatimChar"/>
+        </w:rPr>
+        <w:t xml:space="preserve">SEAT_STALE_MS = 45sn</w:t>
+      </w:r>
+      <w:r>
+        <w:t xml:space="preserve">) ile kontrol edilir. Yani bir kullanıcı 2 heartbeat (&gt;45sn) kaçırırsa koltuğu</w:t>
+      </w:r>
+      <w:r>
+        <w:t xml:space="preserve"> </w:t>
+      </w:r>
+      <w:r>
+        <w:rPr>
+          <w:bCs/>
+          <w:b/>
+        </w:rPr>
+        <w:t xml:space="preserve">anında</w:t>
+      </w:r>
+      <w:r>
+        <w:t xml:space="preserve"> </w:t>
+      </w:r>
+      <w:r>
+        <w:t xml:space="preserve">boşa düşer.</w:t>
+      </w:r>
+      <w:r>
+        <w:t xml:space="preserve"> </w:t>
+      </w:r>
+      <w:r>
+        <w:rPr>
+          <w:bCs/>
+          <w:b/>
+        </w:rPr>
+        <w:t xml:space="preserve">Flutter bu yüzden düzenli heartbeat göndermeli ve çıkışta her şeyi temizlemeli.</w:t>
+      </w:r>
+    </w:p>
+    <w:p>
+      <w:pPr>
+        <w:pStyle w:val="BodyText"/>
+      </w:pPr>
+      <w:r>
+        <w:rPr>
+          <w:bCs/>
+          <w:b/>
+        </w:rPr>
+        <w:t xml:space="preserve">Heartbeat:</w:t>
+      </w:r>
+      <w:r>
+        <w:t xml:space="preserve"> </w:t>
+      </w:r>
+      <w:r>
+        <w:t xml:space="preserve">odada iken her</w:t>
+      </w:r>
+      <w:r>
+        <w:t xml:space="preserve"> </w:t>
+      </w:r>
+      <w:r>
+        <w:rPr>
+          <w:bCs/>
+          <w:b/>
+        </w:rPr>
+        <w:t xml:space="preserve">~15 saniyede bir</w:t>
+      </w:r>
+      <w:r>
+        <w:t xml:space="preserve"> </w:t>
+      </w:r>
+      <w:r>
+        <w:rPr>
+          <w:rStyle w:val="VerbatimChar"/>
+        </w:rPr>
+        <w:t xml:space="preserve">POST /api/chat/rooms/{roomId}/presence</w:t>
+      </w:r>
+      <w:r>
+        <w:t xml:space="preserve"> </w:t>
+      </w:r>
+      <w:r>
+        <w:t xml:space="preserve">(veya join-room heartbeat) çağır. (Backend eşiği 45sn = 3 heartbeat toleransı.)</w:t>
+      </w:r>
+    </w:p>
+    <w:p>
+      <w:pPr>
+        <w:pStyle w:val="BodyText"/>
+      </w:pPr>
+      <w:r>
+        <w:rPr>
+          <w:bCs/>
+          <w:b/>
+        </w:rPr>
+        <w:t xml:space="preserve">Odadan çıkışta ZORUNLU teardown sırası:</w:t>
+      </w:r>
+    </w:p>
+    <w:p>
+      <w:pPr>
+        <w:pStyle w:val="SourceCode"/>
+      </w:pPr>
+      <w:r>
+        <w:rPr>
+          <w:rStyle w:val="VerbatimChar"/>
+        </w:rPr>
+        <w:t xml:space="preserve">Future&lt;void&gt; leaveRoom() async {</w:t>
+      </w:r>
+      <w:r>
+        <w:br/>
+      </w:r>
+      <w:r>
+        <w:rPr>
+          <w:rStyle w:val="VerbatimChar"/>
+        </w:rPr>
+        <w:t xml:space="preserve">  // 1) Backend'e bildir — koltuğu ve presence'ı bırak</w:t>
+      </w:r>
+      <w:r>
+        <w:br/>
+      </w:r>
+      <w:r>
+        <w:rPr>
+          <w:rStyle w:val="VerbatimChar"/>
+        </w:rPr>
+        <w:t xml:space="preserve">  await api.post('/api/live/seats', {'action': 'leave', 'roomId': roomId}); // koltuğu bırak</w:t>
+      </w:r>
+      <w:r>
+        <w:br/>
+      </w:r>
+      <w:r>
+        <w:rPr>
+          <w:rStyle w:val="VerbatimChar"/>
+        </w:rPr>
+        <w:t xml:space="preserve">  await api.leaveRoom(roomId); // presence delete (?leave=1) → backend participant_left yayınlar, 30sn beklemez</w:t>
+      </w:r>
+      <w:r>
+        <w:br/>
+      </w:r>
+      <w:r>
+        <w:rPr>
+          <w:rStyle w:val="VerbatimChar"/>
+        </w:rPr>
+        <w:t xml:space="preserve">  // 2) TRTC</w:t>
+      </w:r>
+      <w:r>
+        <w:br/>
+      </w:r>
+      <w:r>
+        <w:rPr>
+          <w:rStyle w:val="VerbatimChar"/>
+        </w:rPr>
+        <w:t xml:space="preserve">  await trtc.stopLocalAudio();</w:t>
+      </w:r>
+      <w:r>
+        <w:br/>
+      </w:r>
+      <w:r>
+        <w:rPr>
+          <w:rStyle w:val="VerbatimChar"/>
+        </w:rPr>
+        <w:t xml:space="preserve">  await trtc.exitRoom();</w:t>
+      </w:r>
+      <w:r>
+        <w:br/>
+      </w:r>
+      <w:r>
+        <w:rPr>
+          <w:rStyle w:val="VerbatimChar"/>
+        </w:rPr>
+        <w:t xml:space="preserve">  await trtc.dispose();           // TRTC instance dispose</w:t>
+      </w:r>
+      <w:r>
+        <w:br/>
+      </w:r>
+      <w:r>
+        <w:rPr>
+          <w:rStyle w:val="VerbatimChar"/>
+        </w:rPr>
+        <w:t xml:space="preserve">  // 3) SSE</w:t>
+      </w:r>
+      <w:r>
+        <w:br/>
+      </w:r>
+      <w:r>
+        <w:rPr>
+          <w:rStyle w:val="VerbatimChar"/>
+        </w:rPr>
+        <w:t xml:space="preserve">  await _sseSubscription?.cancel();</w:t>
+      </w:r>
+      <w:r>
+        <w:br/>
+      </w:r>
+      <w:r>
+        <w:rPr>
+          <w:rStyle w:val="VerbatimChar"/>
+        </w:rPr>
+        <w:t xml:space="preserve">  _sseClient?.close();</w:t>
+      </w:r>
+      <w:r>
+        <w:br/>
+      </w:r>
+      <w:r>
+        <w:rPr>
+          <w:rStyle w:val="VerbatimChar"/>
+        </w:rPr>
+        <w:t xml:space="preserve">  // 4) Zamanlayıcılar</w:t>
+      </w:r>
+      <w:r>
+        <w:br/>
+      </w:r>
+      <w:r>
+        <w:rPr>
+          <w:rStyle w:val="VerbatimChar"/>
+        </w:rPr>
+        <w:t xml:space="preserve">  _heartbeatTimer?.cancel();</w:t>
+      </w:r>
+      <w:r>
+        <w:br/>
+      </w:r>
+      <w:r>
+        <w:rPr>
+          <w:rStyle w:val="VerbatimChar"/>
+        </w:rPr>
+        <w:t xml:space="preserve">  _giftQueueTimer?.cancel();</w:t>
+      </w:r>
+      <w:r>
+        <w:br/>
+      </w:r>
+      <w:r>
+        <w:rPr>
+          <w:rStyle w:val="VerbatimChar"/>
+        </w:rPr>
+        <w:t xml:space="preserve">  // 5) Controller / animasyon / video</w:t>
+      </w:r>
+      <w:r>
+        <w:br/>
+      </w:r>
+      <w:r>
+        <w:rPr>
+          <w:rStyle w:val="VerbatimChar"/>
+        </w:rPr>
+        <w:t xml:space="preserve">  for (final c in _videoControllers) { await c.dispose(); }</w:t>
+      </w:r>
+      <w:r>
+        <w:br/>
+      </w:r>
+      <w:r>
+        <w:rPr>
+          <w:rStyle w:val="VerbatimChar"/>
+        </w:rPr>
+        <w:t xml:space="preserve">  _videoControllers.clear();</w:t>
+      </w:r>
+      <w:r>
+        <w:br/>
+      </w:r>
+      <w:r>
+        <w:rPr>
+          <w:rStyle w:val="VerbatimChar"/>
+        </w:rPr>
+        <w:t xml:space="preserve">  _lottieController?.dispose();</w:t>
+      </w:r>
+      <w:r>
+        <w:br/>
+      </w:r>
+      <w:r>
+        <w:rPr>
+          <w:rStyle w:val="VerbatimChar"/>
+        </w:rPr>
+        <w:t xml:space="preserve">  _seatScrollController?.dispose();</w:t>
+      </w:r>
+      <w:r>
+        <w:br/>
+      </w:r>
+      <w:r>
+        <w:rPr>
+          <w:rStyle w:val="VerbatimChar"/>
+        </w:rPr>
+        <w:t xml:space="preserve">  _messageFocusNode?.dispose();</w:t>
+      </w:r>
+      <w:r>
+        <w:br/>
+      </w:r>
+      <w:r>
+        <w:rPr>
+          <w:rStyle w:val="VerbatimChar"/>
+        </w:rPr>
+        <w:t xml:space="preserve">  // 6) Cache temizle (§9.6)</w:t>
+      </w:r>
+      <w:r>
+        <w:br/>
+      </w:r>
+      <w:r>
+        <w:rPr>
+          <w:rStyle w:val="VerbatimChar"/>
+        </w:rPr>
+        <w:t xml:space="preserve">  _clearAllRoomCaches();</w:t>
+      </w:r>
+      <w:r>
+        <w:br/>
+      </w:r>
+      <w:r>
+        <w:rPr>
+          <w:rStyle w:val="VerbatimChar"/>
+        </w:rPr>
+        <w:t xml:space="preserve">}</w:t>
+      </w:r>
+    </w:p>
+    <w:p>
+      <w:pPr>
+        <w:numPr>
+          <w:ilvl w:val="0"/>
+          <w:numId w:val="1014"/>
+        </w:numPr>
+        <w:pStyle w:val="Compact"/>
+      </w:pPr>
+      <w:r>
+        <w:t xml:space="preserve">Çıkışta backend</w:t>
+      </w:r>
+      <w:r>
+        <w:t xml:space="preserve"> </w:t>
+      </w:r>
+      <w:r>
+        <w:rPr>
+          <w:bCs/>
+          <w:b/>
+        </w:rPr>
+        <w:t xml:space="preserve">beklemeden</w:t>
+      </w:r>
+      <w:r>
+        <w:t xml:space="preserve"> </w:t>
+      </w:r>
+      <w:r>
+        <w:rPr>
+          <w:rStyle w:val="VerbatimChar"/>
+        </w:rPr>
+        <w:t xml:space="preserve">room_event: user_left</w:t>
+      </w:r>
+      <w:r>
+        <w:t xml:space="preserve"> </w:t>
+      </w:r>
+      <w:r>
+        <w:t xml:space="preserve">yayınlar; diğer istemciler koltuğu hemen boşaltır.</w:t>
+      </w:r>
+    </w:p>
+    <w:p>
+      <w:pPr>
+        <w:numPr>
+          <w:ilvl w:val="0"/>
+          <w:numId w:val="1014"/>
+        </w:numPr>
+        <w:pStyle w:val="Compact"/>
+      </w:pPr>
+      <w:r>
+        <w:t xml:space="preserve">Yeniden girişte</w:t>
+      </w:r>
+      <w:r>
+        <w:t xml:space="preserve"> </w:t>
+      </w:r>
+      <w:r>
+        <w:rPr>
+          <w:rStyle w:val="VerbatimChar"/>
+        </w:rPr>
+        <w:t xml:space="preserve">POST /api/live/join-room</w:t>
+      </w:r>
+      <w:r>
+        <w:t xml:space="preserve"> </w:t>
+      </w:r>
+      <w:r>
+        <w:t xml:space="preserve">→ boş koltuk varsa</w:t>
+      </w:r>
+      <w:r>
+        <w:t xml:space="preserve"> </w:t>
+      </w:r>
+      <w:r>
+        <w:rPr>
+          <w:bCs/>
+          <w:b/>
+        </w:rPr>
+        <w:t xml:space="preserve">otomatik oturur</w:t>
+      </w:r>
+      <w:r>
+        <w:t xml:space="preserve"> </w:t>
+      </w:r>
+      <w:r>
+        <w:t xml:space="preserve">(§1.2),</w:t>
+      </w:r>
+      <w:r>
+        <w:t xml:space="preserve"> </w:t>
+      </w:r>
+      <w:r>
+        <w:rPr>
+          <w:rStyle w:val="VerbatimChar"/>
+        </w:rPr>
+        <w:t xml:space="preserve">POST /api/live/seats action:'take'</w:t>
+      </w:r>
+      <w:r>
+        <w:t xml:space="preserve"> </w:t>
+      </w:r>
+      <w:r>
+        <w:t xml:space="preserve">da çalışır. 45sn stale sayesinde eski hayalet kayıt engel olmaz.</w:t>
+      </w:r>
+    </w:p>
+    <w:bookmarkEnd w:id="48"/>
+    <w:bookmarkStart w:id="49" w:name="X44227f1ec23d8814143b40c10d252ef3057e764"/>
+    <w:p>
+      <w:pPr>
+        <w:pStyle w:val="Heading3"/>
+      </w:pPr>
+      <w:r>
+        <w:t xml:space="preserve">9.5 Tek SSE bağlantısı + Last-Event-ID ile kesintisiz reconnect</w:t>
+      </w:r>
+    </w:p>
+    <w:p>
+      <w:pPr>
+        <w:numPr>
+          <w:ilvl w:val="0"/>
+          <w:numId w:val="1015"/>
+        </w:numPr>
+        <w:pStyle w:val="Compact"/>
+      </w:pPr>
+      <w:r>
+        <w:t xml:space="preserve">Oda başına</w:t>
+      </w:r>
+      <w:r>
+        <w:t xml:space="preserve"> </w:t>
+      </w:r>
+      <w:r>
+        <w:rPr>
+          <w:bCs/>
+          <w:b/>
+        </w:rPr>
+        <w:t xml:space="preserve">TEK</w:t>
+      </w:r>
+      <w:r>
+        <w:t xml:space="preserve"> </w:t>
+      </w:r>
+      <w:r>
+        <w:t xml:space="preserve">SSE bağlantısı aç (</w:t>
+      </w:r>
+      <w:r>
+        <w:rPr>
+          <w:rStyle w:val="VerbatimChar"/>
+        </w:rPr>
+        <w:t xml:space="preserve">GET /api/chat/rooms/{roomId}/stream</w:t>
+      </w:r>
+      <w:r>
+        <w:t xml:space="preserve">). Tüm olaylar (gift/seat/join/leave/mic/admin/mute/kick/music/pk/message/system/room_event)</w:t>
+      </w:r>
+      <w:r>
+        <w:t xml:space="preserve"> </w:t>
+      </w:r>
+      <w:r>
+        <w:rPr>
+          <w:bCs/>
+          <w:b/>
+        </w:rPr>
+        <w:t xml:space="preserve">bu tek akıştan</w:t>
+      </w:r>
+      <w:r>
+        <w:t xml:space="preserve"> </w:t>
+      </w:r>
+      <w:r>
+        <w:t xml:space="preserve">dinlenir. Ayrı ayrı bağlantı açma.</w:t>
+      </w:r>
+    </w:p>
+    <w:p>
+      <w:pPr>
+        <w:numPr>
+          <w:ilvl w:val="0"/>
+          <w:numId w:val="1015"/>
+        </w:numPr>
+        <w:pStyle w:val="Compact"/>
+      </w:pPr>
+      <w:r>
+        <w:rPr>
+          <w:bCs/>
+          <w:b/>
+        </w:rPr>
+        <w:t xml:space="preserve">Last-Event-ID:</w:t>
+      </w:r>
+      <w:r>
+        <w:t xml:space="preserve"> </w:t>
+      </w:r>
+      <w:r>
+        <w:t xml:space="preserve">Backend her olay grubunda</w:t>
+      </w:r>
+      <w:r>
+        <w:t xml:space="preserve"> </w:t>
+      </w:r>
+      <w:r>
+        <w:rPr>
+          <w:rStyle w:val="VerbatimChar"/>
+        </w:rPr>
+        <w:t xml:space="preserve">id: &lt;timestamp&gt;</w:t>
+      </w:r>
+      <w:r>
+        <w:t xml:space="preserve"> </w:t>
+      </w:r>
+      <w:r>
+        <w:t xml:space="preserve">gönderir. Bağlantı koparsa, en son alınan id ile yeniden bağlan:</w:t>
+      </w:r>
+    </w:p>
+    <w:p>
+      <w:pPr>
+        <w:numPr>
+          <w:ilvl w:val="1"/>
+          <w:numId w:val="1016"/>
+        </w:numPr>
+        <w:pStyle w:val="Compact"/>
+      </w:pPr>
+      <w:r>
+        <w:t xml:space="preserve">Web</w:t>
+      </w:r>
+      <w:r>
+        <w:t xml:space="preserve"> </w:t>
+      </w:r>
+      <w:r>
+        <w:rPr>
+          <w:rStyle w:val="VerbatimChar"/>
+        </w:rPr>
+        <w:t xml:space="preserve">EventSource</w:t>
+      </w:r>
+      <w:r>
+        <w:t xml:space="preserve"> </w:t>
+      </w:r>
+      <w:r>
+        <w:t xml:space="preserve">bunu otomatik yapar.</w:t>
+      </w:r>
+    </w:p>
+    <w:p>
+      <w:pPr>
+        <w:numPr>
+          <w:ilvl w:val="1"/>
+          <w:numId w:val="1016"/>
+        </w:numPr>
+        <w:pStyle w:val="Compact"/>
+      </w:pPr>
+      <w:r>
+        <w:t xml:space="preserve">Flutter’da (özel SSE istemcisi) son</w:t>
+      </w:r>
+      <w:r>
+        <w:t xml:space="preserve"> </w:t>
+      </w:r>
+      <w:r>
+        <w:rPr>
+          <w:rStyle w:val="VerbatimChar"/>
+        </w:rPr>
+        <w:t xml:space="preserve">id</w:t>
+      </w:r>
+      <w:r>
+        <w:t xml:space="preserve">’yi sakla ve reconnect’te</w:t>
+      </w:r>
+      <w:r>
+        <w:t xml:space="preserve"> </w:t>
+      </w:r>
+      <w:r>
+        <w:rPr>
+          <w:rStyle w:val="VerbatimChar"/>
+          <w:bCs/>
+          <w:b/>
+        </w:rPr>
+        <w:t xml:space="preserve">Last-Event-ID: &lt;sonId&gt;</w:t>
+      </w:r>
+      <w:r>
+        <w:t xml:space="preserve"> </w:t>
+      </w:r>
+      <w:r>
+        <w:t xml:space="preserve">header’ı (veya</w:t>
+      </w:r>
+      <w:r>
+        <w:t xml:space="preserve"> </w:t>
+      </w:r>
+      <w:r>
+        <w:rPr>
+          <w:rStyle w:val="VerbatimChar"/>
+        </w:rPr>
+        <w:t xml:space="preserve">?lastEventId=&lt;sonId&gt;</w:t>
+      </w:r>
+      <w:r>
+        <w:t xml:space="preserve"> </w:t>
+      </w:r>
+      <w:r>
+        <w:t xml:space="preserve">query) ile bağlan. Backend o zaman damgasından sonra kaçırılan olayları</w:t>
+      </w:r>
+      <w:r>
+        <w:t xml:space="preserve"> </w:t>
+      </w:r>
+      <w:r>
+        <w:rPr>
+          <w:bCs/>
+          <w:b/>
+        </w:rPr>
+        <w:t xml:space="preserve">tekrar oynatır</w:t>
+      </w:r>
+      <w:r>
+        <w:t xml:space="preserve"> </w:t>
+      </w:r>
+      <w:r>
+        <w:t xml:space="preserve">→ hiçbir olay kaçmaz.</w:t>
+      </w:r>
+    </w:p>
+    <w:p>
+      <w:pPr>
+        <w:numPr>
+          <w:ilvl w:val="0"/>
+          <w:numId w:val="1015"/>
+        </w:numPr>
+        <w:pStyle w:val="Compact"/>
+      </w:pPr>
+      <w:r>
+        <w:t xml:space="preserve">Reconnect stratejisi: exponential backoff (1s, 2s, 4s… max ~15s). Yeniden bağlanınca ek olarak</w:t>
+      </w:r>
+      <w:r>
+        <w:t xml:space="preserve"> </w:t>
+      </w:r>
+      <w:r>
+        <w:rPr>
+          <w:rStyle w:val="VerbatimChar"/>
+        </w:rPr>
+        <w:t xml:space="preserve">GET .../state</w:t>
+      </w:r>
+      <w:r>
+        <w:t xml:space="preserve"> </w:t>
+      </w:r>
+      <w:r>
+        <w:t xml:space="preserve">ile koltuk/katılımcı haritasını tazele (kesin doğruluk için).</w:t>
+      </w:r>
+    </w:p>
+    <w:p>
+      <w:pPr>
+        <w:pStyle w:val="SourceCode"/>
+      </w:pPr>
+      <w:r>
+        <w:rPr>
+          <w:rStyle w:val="VerbatimChar"/>
+        </w:rPr>
+        <w:t xml:space="preserve">String? _lastEventId;</w:t>
+      </w:r>
+      <w:r>
+        <w:br/>
+      </w:r>
+      <w:r>
+        <w:rPr>
+          <w:rStyle w:val="VerbatimChar"/>
+        </w:rPr>
+        <w:t xml:space="preserve">StreamSubscription? _sseSubscription;</w:t>
+      </w:r>
+      <w:r>
+        <w:br/>
+      </w:r>
+      <w:r>
+        <w:br/>
+      </w:r>
+      <w:r>
+        <w:rPr>
+          <w:rStyle w:val="VerbatimChar"/>
+        </w:rPr>
+        <w:t xml:space="preserve">void _connectSse() {</w:t>
+      </w:r>
+      <w:r>
+        <w:br/>
+      </w:r>
+      <w:r>
+        <w:rPr>
+          <w:rStyle w:val="VerbatimChar"/>
+        </w:rPr>
+        <w:t xml:space="preserve">  final headers = {'Authorization': 'Bearer $jwt'};</w:t>
+      </w:r>
+      <w:r>
+        <w:br/>
+      </w:r>
+      <w:r>
+        <w:rPr>
+          <w:rStyle w:val="VerbatimChar"/>
+        </w:rPr>
+        <w:t xml:space="preserve">  if (_lastEventId != null) headers['Last-Event-ID'] = _lastEventId!;</w:t>
+      </w:r>
+      <w:r>
+        <w:br/>
+      </w:r>
+      <w:r>
+        <w:rPr>
+          <w:rStyle w:val="VerbatimChar"/>
+        </w:rPr>
+        <w:t xml:space="preserve">  _sseSubscription = sseClient.connect(streamUrl, headers: headers).listen(</w:t>
+      </w:r>
+      <w:r>
+        <w:br/>
+      </w:r>
+      <w:r>
+        <w:rPr>
+          <w:rStyle w:val="VerbatimChar"/>
+        </w:rPr>
+        <w:t xml:space="preserve">    (frame) {</w:t>
+      </w:r>
+      <w:r>
+        <w:br/>
+      </w:r>
+      <w:r>
+        <w:rPr>
+          <w:rStyle w:val="VerbatimChar"/>
+        </w:rPr>
+        <w:t xml:space="preserve">      if (frame.id != null) _lastEventId = frame.id;   // sonra reconnect'te geri gönder</w:t>
+      </w:r>
+      <w:r>
+        <w:br/>
+      </w:r>
+      <w:r>
+        <w:rPr>
+          <w:rStyle w:val="VerbatimChar"/>
+        </w:rPr>
+        <w:t xml:space="preserve">      _dispatchEvent(frame);                            // tek switch: type'a göre</w:t>
+      </w:r>
+      <w:r>
+        <w:br/>
+      </w:r>
+      <w:r>
+        <w:rPr>
+          <w:rStyle w:val="VerbatimChar"/>
+        </w:rPr>
+        <w:t xml:space="preserve">    },</w:t>
+      </w:r>
+      <w:r>
+        <w:br/>
+      </w:r>
+      <w:r>
+        <w:rPr>
+          <w:rStyle w:val="VerbatimChar"/>
+        </w:rPr>
+        <w:t xml:space="preserve">    onError: (_) =&gt; _scheduleReconnectWithBackoff(),</w:t>
+      </w:r>
+      <w:r>
+        <w:br/>
+      </w:r>
+      <w:r>
+        <w:rPr>
+          <w:rStyle w:val="VerbatimChar"/>
+        </w:rPr>
+        <w:t xml:space="preserve">    onDone: () =&gt; _scheduleReconnectWithBackoff(),</w:t>
+      </w:r>
+      <w:r>
+        <w:br/>
+      </w:r>
+      <w:r>
+        <w:rPr>
+          <w:rStyle w:val="VerbatimChar"/>
+        </w:rPr>
+        <w:t xml:space="preserve">  );</w:t>
+      </w:r>
+      <w:r>
+        <w:br/>
+      </w:r>
+      <w:r>
+        <w:rPr>
+          <w:rStyle w:val="VerbatimChar"/>
+        </w:rPr>
+        <w:t xml:space="preserve">}</w:t>
+      </w:r>
+    </w:p>
+    <w:bookmarkEnd w:id="49"/>
+    <w:bookmarkStart w:id="50" w:name="X88ba08c0ad9ec9c198bf85383ac9581ff24bfce"/>
+    <w:p>
+      <w:pPr>
+        <w:pStyle w:val="Heading3"/>
+      </w:pPr>
+      <w:r>
+        <w:t xml:space="preserve">9.6 Bellek temizliği + cache yönetimi (sızıntı yok)</w:t>
+      </w:r>
+    </w:p>
+    <w:p>
+      <w:pPr>
+        <w:pStyle w:val="FirstParagraph"/>
+      </w:pPr>
+      <w:r>
+        <w:t xml:space="preserve">Odadan çıkışta / oda değiştirirken</w:t>
+      </w:r>
+      <w:r>
+        <w:t xml:space="preserve"> </w:t>
+      </w:r>
+      <w:r>
+        <w:rPr>
+          <w:bCs/>
+          <w:b/>
+        </w:rPr>
+        <w:t xml:space="preserve">her şeyi</w:t>
+      </w:r>
+      <w:r>
+        <w:t xml:space="preserve"> </w:t>
+      </w:r>
+      <w:r>
+        <w:t xml:space="preserve">temizle:</w:t>
+      </w:r>
+      <w:r>
+        <w:t xml:space="preserve"> </w:t>
+      </w:r>
+      <w:r>
+        <w:t xml:space="preserve">-</w:t>
+      </w:r>
+      <w:r>
+        <w:t xml:space="preserve"> </w:t>
+      </w:r>
+      <w:r>
+        <w:rPr>
+          <w:bCs/>
+          <w:b/>
+        </w:rPr>
+        <w:t xml:space="preserve">Controller’lar:</w:t>
+      </w:r>
+      <w:r>
+        <w:t xml:space="preserve"> </w:t>
+      </w:r>
+      <w:r>
+        <w:t xml:space="preserve">video, lottie, animation, scroll, text, seat controller →</w:t>
+      </w:r>
+      <w:r>
+        <w:t xml:space="preserve"> </w:t>
+      </w:r>
+      <w:r>
+        <w:rPr>
+          <w:rStyle w:val="VerbatimChar"/>
+        </w:rPr>
+        <w:t xml:space="preserve">dispose()</w:t>
+      </w:r>
+      <w:r>
+        <w:t xml:space="preserve">.</w:t>
+      </w:r>
+      <w:r>
+        <w:t xml:space="preserve"> </w:t>
+      </w:r>
+      <w:r>
+        <w:t xml:space="preserve">-</w:t>
+      </w:r>
+      <w:r>
+        <w:t xml:space="preserve"> </w:t>
+      </w:r>
+      <w:r>
+        <w:rPr>
+          <w:bCs/>
+          <w:b/>
+        </w:rPr>
+        <w:t xml:space="preserve">Stream/subscription:</w:t>
+      </w:r>
+      <w:r>
+        <w:t xml:space="preserve"> </w:t>
+      </w:r>
+      <w:r>
+        <w:t xml:space="preserve">SSE, mesaj stream, presence stream →</w:t>
+      </w:r>
+      <w:r>
+        <w:t xml:space="preserve"> </w:t>
+      </w:r>
+      <w:r>
+        <w:rPr>
+          <w:rStyle w:val="VerbatimChar"/>
+        </w:rPr>
+        <w:t xml:space="preserve">cancel()</w:t>
+      </w:r>
+      <w:r>
+        <w:t xml:space="preserve">.</w:t>
+      </w:r>
+      <w:r>
+        <w:t xml:space="preserve"> </w:t>
+      </w:r>
+      <w:r>
+        <w:t xml:space="preserve">-</w:t>
+      </w:r>
+      <w:r>
+        <w:t xml:space="preserve"> </w:t>
+      </w:r>
+      <w:r>
+        <w:rPr>
+          <w:bCs/>
+          <w:b/>
+        </w:rPr>
+        <w:t xml:space="preserve">Timer’lar:</w:t>
+      </w:r>
+      <w:r>
+        <w:t xml:space="preserve"> </w:t>
+      </w:r>
+      <w:r>
+        <w:t xml:space="preserve">heartbeat, gift queue, animasyon süreleri →</w:t>
+      </w:r>
+      <w:r>
+        <w:t xml:space="preserve"> </w:t>
+      </w:r>
+      <w:r>
+        <w:rPr>
+          <w:rStyle w:val="VerbatimChar"/>
+        </w:rPr>
+        <w:t xml:space="preserve">cancel()</w:t>
+      </w:r>
+      <w:r>
+        <w:t xml:space="preserve">.</w:t>
+      </w:r>
+      <w:r>
+        <w:t xml:space="preserve"> </w:t>
+      </w:r>
+      <w:r>
+        <w:t xml:space="preserve">-</w:t>
+      </w:r>
+      <w:r>
+        <w:t xml:space="preserve"> </w:t>
+      </w:r>
+      <w:r>
+        <w:rPr>
+          <w:bCs/>
+          <w:b/>
+        </w:rPr>
+        <w:t xml:space="preserve">Focus/audio/rtc/player:</w:t>
+      </w:r>
+      <w:r>
+        <w:t xml:space="preserve"> </w:t>
+      </w:r>
+      <w:r>
+        <w:t xml:space="preserve">focus node dispose, audio session stop, TRTC dispose, video player dispose.</w:t>
+      </w:r>
+      <w:r>
+        <w:t xml:space="preserve"> </w:t>
+      </w:r>
+      <w:r>
+        <w:t xml:space="preserve">-</w:t>
+      </w:r>
+      <w:r>
+        <w:t xml:space="preserve"> </w:t>
+      </w:r>
+      <w:r>
+        <w:rPr>
+          <w:bCs/>
+          <w:b/>
+        </w:rPr>
+        <w:t xml:space="preserve">Cache’ler (tümü):</w:t>
+      </w:r>
+      <w:r>
+        <w:t xml:space="preserve"> </w:t>
+      </w:r>
+      <w:r>
+        <w:rPr>
+          <w:rStyle w:val="VerbatimChar"/>
+        </w:rPr>
+        <w:t xml:space="preserve">RoomCache</w:t>
+      </w:r>
+      <w:r>
+        <w:t xml:space="preserve">,</w:t>
+      </w:r>
+      <w:r>
+        <w:t xml:space="preserve"> </w:t>
+      </w:r>
+      <w:r>
+        <w:rPr>
+          <w:rStyle w:val="VerbatimChar"/>
+        </w:rPr>
+        <w:t xml:space="preserve">GiftCache</w:t>
+      </w:r>
+      <w:r>
+        <w:t xml:space="preserve">,</w:t>
+      </w:r>
+      <w:r>
+        <w:t xml:space="preserve"> </w:t>
+      </w:r>
+      <w:r>
+        <w:rPr>
+          <w:rStyle w:val="VerbatimChar"/>
+        </w:rPr>
+        <w:t xml:space="preserve">SeatCache</w:t>
+      </w:r>
+      <w:r>
+        <w:t xml:space="preserve">,</w:t>
+      </w:r>
+      <w:r>
+        <w:t xml:space="preserve"> </w:t>
+      </w:r>
+      <w:r>
+        <w:rPr>
+          <w:rStyle w:val="VerbatimChar"/>
+        </w:rPr>
+        <w:t xml:space="preserve">ParticipantCache</w:t>
+      </w:r>
+      <w:r>
+        <w:t xml:space="preserve">,</w:t>
+      </w:r>
+      <w:r>
+        <w:t xml:space="preserve"> </w:t>
+      </w:r>
+      <w:r>
+        <w:rPr>
+          <w:rStyle w:val="VerbatimChar"/>
+        </w:rPr>
+        <w:t xml:space="preserve">MessageCache</w:t>
+      </w:r>
+      <w:r>
+        <w:t xml:space="preserve">,</w:t>
+      </w:r>
+      <w:r>
+        <w:t xml:space="preserve"> </w:t>
+      </w:r>
+      <w:r>
+        <w:rPr>
+          <w:rStyle w:val="VerbatimChar"/>
+        </w:rPr>
+        <w:t xml:space="preserve">AnimationCache</w:t>
+      </w:r>
+      <w:r>
+        <w:t xml:space="preserve"> </w:t>
+      </w:r>
+      <w:r>
+        <w:t xml:space="preserve">→ temizle. Ayrıca</w:t>
+      </w:r>
+      <w:r>
+        <w:t xml:space="preserve"> </w:t>
+      </w:r>
+      <w:r>
+        <w:rPr>
+          <w:rStyle w:val="VerbatimChar"/>
+        </w:rPr>
+        <w:t xml:space="preserve">_shownGiftIds.clear()</w:t>
+      </w:r>
+      <w:r>
+        <w:t xml:space="preserve">.</w:t>
+      </w:r>
+    </w:p>
+    <w:p>
+      <w:pPr>
+        <w:pStyle w:val="SourceCode"/>
+      </w:pPr>
+      <w:r>
+        <w:rPr>
+          <w:rStyle w:val="VerbatimChar"/>
+        </w:rPr>
+        <w:t xml:space="preserve">void _clearAllRoomCaches() {</w:t>
+      </w:r>
+      <w:r>
+        <w:br/>
+      </w:r>
+      <w:r>
+        <w:rPr>
+          <w:rStyle w:val="VerbatimChar"/>
+        </w:rPr>
+        <w:t xml:space="preserve">  roomCache.clear(); giftCache.clear(); seatCache.clear();</w:t>
+      </w:r>
+      <w:r>
+        <w:br/>
+      </w:r>
+      <w:r>
+        <w:rPr>
+          <w:rStyle w:val="VerbatimChar"/>
+        </w:rPr>
+        <w:t xml:space="preserve">  participantCache.clear(); messageCache.clear(); animationCache.clear();</w:t>
+      </w:r>
+      <w:r>
+        <w:br/>
+      </w:r>
+      <w:r>
+        <w:rPr>
+          <w:rStyle w:val="VerbatimChar"/>
+        </w:rPr>
+        <w:t xml:space="preserve">  _shownGiftIds.clear(); _recentSenders.clear();</w:t>
+      </w:r>
+      <w:r>
+        <w:br/>
+      </w:r>
+      <w:r>
+        <w:rPr>
+          <w:rStyle w:val="VerbatimChar"/>
+        </w:rPr>
+        <w:t xml:space="preserve">}</w:t>
+      </w:r>
+    </w:p>
+    <w:p>
+      <w:pPr>
+        <w:numPr>
+          <w:ilvl w:val="0"/>
+          <w:numId w:val="1017"/>
+        </w:numPr>
+        <w:pStyle w:val="Compact"/>
+      </w:pPr>
+      <w:r>
+        <w:rPr>
+          <w:bCs/>
+          <w:b/>
+        </w:rPr>
+        <w:t xml:space="preserve">Görüntü cache limiti:</w:t>
+      </w:r>
+      <w:r>
+        <w:t xml:space="preserve"> </w:t>
+      </w:r>
+      <w:r>
+        <w:t xml:space="preserve">uygulama başında</w:t>
+      </w:r>
+      <w:r>
+        <w:t xml:space="preserve"> </w:t>
+      </w:r>
+      <w:r>
+        <w:rPr>
+          <w:rStyle w:val="VerbatimChar"/>
+        </w:rPr>
+        <w:t xml:space="preserve">PaintingBinding.instance.imageCache.maximumSizeBytes = 100 &lt;&lt; 20; // 100MB</w:t>
+      </w:r>
+      <w:r>
+        <w:t xml:space="preserve">. Oda değişiminde büyük asset’ler için</w:t>
+      </w:r>
+      <w:r>
+        <w:t xml:space="preserve"> </w:t>
+      </w:r>
+      <w:r>
+        <w:rPr>
+          <w:rStyle w:val="VerbatimChar"/>
+        </w:rPr>
+        <w:t xml:space="preserve">imageCache.clear()</w:t>
+      </w:r>
+      <w:r>
+        <w:t xml:space="preserve">/</w:t>
+      </w:r>
+      <w:r>
+        <w:rPr>
+          <w:rStyle w:val="VerbatimChar"/>
+        </w:rPr>
+        <w:t xml:space="preserve">clearLiveImages()</w:t>
+      </w:r>
+      <w:r>
+        <w:t xml:space="preserve"> </w:t>
+      </w:r>
+      <w:r>
+        <w:t xml:space="preserve">çağrılabilir.</w:t>
+      </w:r>
+    </w:p>
+    <w:bookmarkEnd w:id="50"/>
+    <w:bookmarkStart w:id="51" w:name="performans-donmakasma-yok"/>
+    <w:p>
+      <w:pPr>
+        <w:pStyle w:val="Heading3"/>
+      </w:pPr>
+      <w:r>
+        <w:t xml:space="preserve">9.7 Performans (donma/kasma yok)</w:t>
+      </w:r>
+    </w:p>
+    <w:p>
+      <w:pPr>
+        <w:numPr>
+          <w:ilvl w:val="0"/>
+          <w:numId w:val="1018"/>
+        </w:numPr>
+        <w:pStyle w:val="Compact"/>
+      </w:pPr>
+      <w:r>
+        <w:rPr>
+          <w:bCs/>
+          <w:b/>
+        </w:rPr>
+        <w:t xml:space="preserve">State yönetimi:</w:t>
+      </w:r>
+      <w:r>
+        <w:t xml:space="preserve"> </w:t>
+      </w:r>
+      <w:r>
+        <w:t xml:space="preserve">Riverpod veya Bloc kullan;</w:t>
+      </w:r>
+      <w:r>
+        <w:t xml:space="preserve"> </w:t>
+      </w:r>
+      <w:r>
+        <w:rPr>
+          <w:rStyle w:val="VerbatimChar"/>
+        </w:rPr>
+        <w:t xml:space="preserve">setState</w:t>
+      </w:r>
+      <w:r>
+        <w:t xml:space="preserve"> </w:t>
+      </w:r>
+      <w:r>
+        <w:t xml:space="preserve">ile tüm ekranı yeniden çizme. Koltuk, mesaj, hediye katmanlarını ayrı provider/bloc ile böl.</w:t>
+      </w:r>
+    </w:p>
+    <w:p>
+      <w:pPr>
+        <w:numPr>
+          <w:ilvl w:val="0"/>
+          <w:numId w:val="1018"/>
+        </w:numPr>
+        <w:pStyle w:val="Compact"/>
+      </w:pPr>
+      <w:r>
+        <w:rPr>
+          <w:rStyle w:val="VerbatimChar"/>
+          <w:bCs/>
+          <w:b/>
+        </w:rPr>
+        <w:t xml:space="preserve">const</w:t>
+      </w:r>
+      <w:r>
+        <w:rPr>
+          <w:bCs/>
+          <w:b/>
+        </w:rPr>
+        <w:t xml:space="preserve"> </w:t>
+      </w:r>
+      <w:r>
+        <w:rPr>
+          <w:bCs/>
+          <w:b/>
+        </w:rPr>
+        <w:t xml:space="preserve">widget’lar:</w:t>
+      </w:r>
+      <w:r>
+        <w:t xml:space="preserve"> </w:t>
+      </w:r>
+      <w:r>
+        <w:t xml:space="preserve">değişmeyen widget’ları</w:t>
+      </w:r>
+      <w:r>
+        <w:t xml:space="preserve"> </w:t>
+      </w:r>
+      <w:r>
+        <w:rPr>
+          <w:rStyle w:val="VerbatimChar"/>
+        </w:rPr>
+        <w:t xml:space="preserve">const</w:t>
+      </w:r>
+      <w:r>
+        <w:t xml:space="preserve"> </w:t>
+      </w:r>
+      <w:r>
+        <w:t xml:space="preserve">yap.</w:t>
+      </w:r>
+    </w:p>
+    <w:p>
+      <w:pPr>
+        <w:numPr>
+          <w:ilvl w:val="0"/>
+          <w:numId w:val="1018"/>
+        </w:numPr>
+        <w:pStyle w:val="Compact"/>
+      </w:pPr>
+      <w:r>
+        <w:rPr>
+          <w:rStyle w:val="VerbatimChar"/>
+          <w:bCs/>
+          <w:b/>
+        </w:rPr>
+        <w:t xml:space="preserve">AutomaticKeepAlive</w:t>
+      </w:r>
+      <w:r>
+        <w:rPr>
+          <w:bCs/>
+          <w:b/>
+        </w:rPr>
+        <w:t xml:space="preserve">:</w:t>
+      </w:r>
+      <w:r>
+        <w:t xml:space="preserve"> </w:t>
+      </w:r>
+      <w:r>
+        <w:t xml:space="preserve">yalnızca gerçekten gereken (ör. sekme içeriği) yerlerde kullan; her yerde değil.</w:t>
+      </w:r>
+    </w:p>
+    <w:p>
+      <w:pPr>
+        <w:numPr>
+          <w:ilvl w:val="0"/>
+          <w:numId w:val="1018"/>
+        </w:numPr>
+        <w:pStyle w:val="Compact"/>
+      </w:pPr>
+      <w:r>
+        <w:rPr>
+          <w:rStyle w:val="VerbatimChar"/>
+          <w:bCs/>
+          <w:b/>
+        </w:rPr>
+        <w:t xml:space="preserve">RepaintBoundary</w:t>
+      </w:r>
+      <w:r>
+        <w:rPr>
+          <w:bCs/>
+          <w:b/>
+        </w:rPr>
+        <w:t xml:space="preserve">:</w:t>
+      </w:r>
+      <w:r>
+        <w:t xml:space="preserve"> </w:t>
+      </w:r>
+      <w:r>
+        <w:t xml:space="preserve">hediye animasyon overlay’i, koltuk grid’i ve mesaj listesi gibi sık çizilen katmanları</w:t>
+      </w:r>
+      <w:r>
+        <w:t xml:space="preserve"> </w:t>
+      </w:r>
+      <w:r>
+        <w:rPr>
+          <w:rStyle w:val="VerbatimChar"/>
+        </w:rPr>
+        <w:t xml:space="preserve">RepaintBoundary</w:t>
+      </w:r>
+      <w:r>
+        <w:t xml:space="preserve"> </w:t>
+      </w:r>
+      <w:r>
+        <w:t xml:space="preserve">ile sar → gereksiz repaint yayılmasın.</w:t>
+      </w:r>
+    </w:p>
+    <w:p>
+      <w:pPr>
+        <w:numPr>
+          <w:ilvl w:val="0"/>
+          <w:numId w:val="1018"/>
+        </w:numPr>
+        <w:pStyle w:val="Compact"/>
+      </w:pPr>
+      <w:r>
+        <w:rPr>
+          <w:bCs/>
+          <w:b/>
+        </w:rPr>
+        <w:t xml:space="preserve">Sanal liste (virtual scroll):</w:t>
+      </w:r>
+      <w:r>
+        <w:t xml:space="preserve"> </w:t>
+      </w:r>
+      <w:r>
+        <w:t xml:space="preserve">mesaj/katılımcı/hediye listelerinde</w:t>
+      </w:r>
+      <w:r>
+        <w:t xml:space="preserve"> </w:t>
+      </w:r>
+      <w:r>
+        <w:rPr>
+          <w:rStyle w:val="VerbatimChar"/>
+        </w:rPr>
+        <w:t xml:space="preserve">ListView.builder</w:t>
+      </w:r>
+      <w:r>
+        <w:t xml:space="preserve"> </w:t>
+      </w:r>
+      <w:r>
+        <w:t xml:space="preserve">(lazy). Tümünü belleğe alma.</w:t>
+      </w:r>
+    </w:p>
+    <w:p>
+      <w:pPr>
+        <w:numPr>
+          <w:ilvl w:val="0"/>
+          <w:numId w:val="1018"/>
+        </w:numPr>
+        <w:pStyle w:val="Compact"/>
+      </w:pPr>
+      <w:r>
+        <w:rPr>
+          <w:bCs/>
+          <w:b/>
+        </w:rPr>
+        <w:t xml:space="preserve">Lazy loading:</w:t>
+      </w:r>
+      <w:r>
+        <w:t xml:space="preserve"> </w:t>
+      </w:r>
+      <w:r>
+        <w:t xml:space="preserve">ağır asset’leri (video/lottie) yalnızca gösterileceği anda yükle; önizleme için</w:t>
+      </w:r>
+      <w:r>
+        <w:t xml:space="preserve"> </w:t>
+      </w:r>
+      <w:r>
+        <w:rPr>
+          <w:rStyle w:val="VerbatimChar"/>
+        </w:rPr>
+        <w:t xml:space="preserve">thumbnailUrl</w:t>
+      </w:r>
+      <w:r>
+        <w:t xml:space="preserve">.</w:t>
+      </w:r>
+    </w:p>
+    <w:bookmarkEnd w:id="51"/>
+    <w:bookmarkStart w:id="52" w:name="görüntü-performansı"/>
+    <w:p>
+      <w:pPr>
+        <w:pStyle w:val="Heading3"/>
+      </w:pPr>
+      <w:r>
+        <w:t xml:space="preserve">9.8 Görüntü performansı</w:t>
+      </w:r>
+    </w:p>
+    <w:p>
+      <w:pPr>
+        <w:numPr>
+          <w:ilvl w:val="0"/>
+          <w:numId w:val="1019"/>
+        </w:numPr>
+        <w:pStyle w:val="Compact"/>
+      </w:pPr>
+      <w:r>
+        <w:rPr>
+          <w:bCs/>
+          <w:b/>
+        </w:rPr>
+        <w:t xml:space="preserve">Formatlar:</w:t>
+      </w:r>
+      <w:r>
+        <w:t xml:space="preserve"> </w:t>
+      </w:r>
+      <w:r>
+        <w:t xml:space="preserve">PNG/WebP/AVIF desteği (</w:t>
+      </w:r>
+      <w:r>
+        <w:rPr>
+          <w:rStyle w:val="VerbatimChar"/>
+        </w:rPr>
+        <w:t xml:space="preserve">assetFormat</w:t>
+      </w:r>
+      <w:r>
+        <w:t xml:space="preserve">’a göre). Mümkünse WebP/AVIF tercih et (daha küçük).</w:t>
+      </w:r>
+    </w:p>
+    <w:p>
+      <w:pPr>
+        <w:numPr>
+          <w:ilvl w:val="0"/>
+          <w:numId w:val="1019"/>
+        </w:numPr>
+        <w:pStyle w:val="Compact"/>
+      </w:pPr>
+      <w:r>
+        <w:rPr>
+          <w:bCs/>
+          <w:b/>
+        </w:rPr>
+        <w:t xml:space="preserve">Thumbnail:</w:t>
+      </w:r>
+      <w:r>
+        <w:t xml:space="preserve"> </w:t>
+      </w:r>
+      <w:r>
+        <w:t xml:space="preserve">liste ve poster için</w:t>
+      </w:r>
+      <w:r>
+        <w:t xml:space="preserve"> </w:t>
+      </w:r>
+      <w:r>
+        <w:rPr>
+          <w:rStyle w:val="VerbatimChar"/>
+        </w:rPr>
+        <w:t xml:space="preserve">thumbnailUrl</w:t>
+      </w:r>
+      <w:r>
+        <w:t xml:space="preserve"> </w:t>
+      </w:r>
+      <w:r>
+        <w:t xml:space="preserve">kullan; tam çözünürlüğü yalnızca gerektiğinde.</w:t>
+      </w:r>
+    </w:p>
+    <w:p>
+      <w:pPr>
+        <w:numPr>
+          <w:ilvl w:val="0"/>
+          <w:numId w:val="1019"/>
+        </w:numPr>
+        <w:pStyle w:val="Compact"/>
+      </w:pPr>
+      <w:r>
+        <w:rPr>
+          <w:rStyle w:val="VerbatimChar"/>
+          <w:bCs/>
+          <w:b/>
+        </w:rPr>
+        <w:t xml:space="preserve">CachedNetworkImage</w:t>
+      </w:r>
+      <w:r>
+        <w:rPr>
+          <w:bCs/>
+          <w:b/>
+        </w:rPr>
+        <w:t xml:space="preserve">:</w:t>
+      </w:r>
+      <w:r>
+        <w:t xml:space="preserve"> </w:t>
+      </w:r>
+      <w:r>
+        <w:t xml:space="preserve">tüm ağ görselleri için;</w:t>
+      </w:r>
+      <w:r>
+        <w:t xml:space="preserve"> </w:t>
+      </w:r>
+      <w:r>
+        <w:rPr>
+          <w:rStyle w:val="VerbatimChar"/>
+        </w:rPr>
+        <w:t xml:space="preserve">placeholder</w:t>
+      </w:r>
+      <w:r>
+        <w:t xml:space="preserve"> </w:t>
+      </w:r>
+      <w:r>
+        <w:t xml:space="preserve">=</w:t>
+      </w:r>
+      <w:r>
+        <w:t xml:space="preserve"> </w:t>
+      </w:r>
+      <w:r>
+        <w:rPr>
+          <w:rStyle w:val="VerbatimChar"/>
+        </w:rPr>
+        <w:t xml:space="preserve">thumbnailUrl</w:t>
+      </w:r>
+      <w:r>
+        <w:t xml:space="preserve"> </w:t>
+      </w:r>
+      <w:r>
+        <w:t xml:space="preserve">veya shimmer,</w:t>
+      </w:r>
+      <w:r>
+        <w:t xml:space="preserve"> </w:t>
+      </w:r>
+      <w:r>
+        <w:rPr>
+          <w:rStyle w:val="VerbatimChar"/>
+        </w:rPr>
+        <w:t xml:space="preserve">errorWidget</w:t>
+      </w:r>
+      <w:r>
+        <w:t xml:space="preserve"> </w:t>
+      </w:r>
+      <w:r>
+        <w:t xml:space="preserve">= ikon/emoji fallback.</w:t>
+      </w:r>
+    </w:p>
+    <w:p>
+      <w:pPr>
+        <w:numPr>
+          <w:ilvl w:val="0"/>
+          <w:numId w:val="1019"/>
+        </w:numPr>
+        <w:pStyle w:val="Compact"/>
+      </w:pPr>
+      <w:r>
+        <w:rPr>
+          <w:bCs/>
+          <w:b/>
+        </w:rPr>
+        <w:t xml:space="preserve">Precache:</w:t>
+      </w:r>
+      <w:r>
+        <w:t xml:space="preserve"> </w:t>
+      </w:r>
+      <w:r>
+        <w:t xml:space="preserve">odaya girerken sık kullanılan koltuk/hediye ikonlarını</w:t>
+      </w:r>
+      <w:r>
+        <w:t xml:space="preserve"> </w:t>
+      </w:r>
+      <w:r>
+        <w:rPr>
+          <w:rStyle w:val="VerbatimChar"/>
+        </w:rPr>
+        <w:t xml:space="preserve">precacheImage</w:t>
+      </w:r>
+      <w:r>
+        <w:t xml:space="preserve"> </w:t>
+      </w:r>
+      <w:r>
+        <w:t xml:space="preserve">ile önceden yükle → ilk gösterimde takılma olmaz.</w:t>
+      </w:r>
+    </w:p>
+    <w:bookmarkEnd w:id="52"/>
+    <w:bookmarkStart w:id="53" w:name="sonuç-bu-bölümün-kabul-kriterleri"/>
+    <w:p>
+      <w:pPr>
+        <w:pStyle w:val="Heading3"/>
+      </w:pPr>
+      <w:r>
+        <w:t xml:space="preserve">9.9 Sonuç (bu bölümün kabul kriterleri)</w:t>
+      </w:r>
+    </w:p>
+    <w:p>
+      <w:pPr>
+        <w:numPr>
+          <w:ilvl w:val="0"/>
+          <w:numId w:val="1020"/>
+        </w:numPr>
+        <w:pStyle w:val="Compact"/>
+      </w:pPr>
+      <w:r>
+        <w:t xml:space="preserve">☐ Hediye animasyonu</w:t>
+      </w:r>
+      <w:r>
+        <w:t xml:space="preserve"> </w:t>
+      </w:r>
+      <w:r>
+        <w:rPr>
+          <w:bCs/>
+          <w:b/>
+        </w:rPr>
+        <w:t xml:space="preserve">yalnızca SSE</w:t>
+      </w:r>
+      <w:r>
+        <w:rPr>
+          <w:bCs/>
+          <w:b/>
+        </w:rPr>
+        <w:t xml:space="preserve"> </w:t>
+      </w:r>
+      <w:r>
+        <w:rPr>
+          <w:rStyle w:val="VerbatimChar"/>
+          <w:bCs/>
+          <w:b/>
+        </w:rPr>
+        <w:t xml:space="preserve">gift</w:t>
+      </w:r>
+      <w:r>
+        <w:rPr>
+          <w:bCs/>
+          <w:b/>
+        </w:rPr>
+        <w:t xml:space="preserve"> </w:t>
+      </w:r>
+      <w:r>
+        <w:rPr>
+          <w:bCs/>
+          <w:b/>
+        </w:rPr>
+        <w:t xml:space="preserve">olayıyla</w:t>
+      </w:r>
+      <w:r>
+        <w:t xml:space="preserve"> </w:t>
+      </w:r>
+      <w:r>
+        <w:t xml:space="preserve">başlar; gönderen dahil</w:t>
+      </w:r>
+      <w:r>
+        <w:t xml:space="preserve"> </w:t>
+      </w:r>
+      <w:r>
+        <w:rPr>
+          <w:bCs/>
+          <w:b/>
+        </w:rPr>
+        <w:t xml:space="preserve">tüm cihazlarda aynı anda</w:t>
+      </w:r>
+      <w:r>
+        <w:t xml:space="preserve"> </w:t>
+      </w:r>
+      <w:r>
+        <w:t xml:space="preserve">oynar; lokal başlatma yok.</w:t>
+      </w:r>
+    </w:p>
+    <w:p>
+      <w:pPr>
+        <w:numPr>
+          <w:ilvl w:val="0"/>
+          <w:numId w:val="1020"/>
+        </w:numPr>
+        <w:pStyle w:val="Compact"/>
+      </w:pPr>
+      <w:r>
+        <w:t xml:space="preserve">☐ Aynı</w:t>
+      </w:r>
+      <w:r>
+        <w:t xml:space="preserve"> </w:t>
+      </w:r>
+      <w:r>
+        <w:rPr>
+          <w:rStyle w:val="VerbatimChar"/>
+        </w:rPr>
+        <w:t xml:space="preserve">giftId</w:t>
+      </w:r>
+      <w:r>
+        <w:t xml:space="preserve"> </w:t>
+      </w:r>
+      <w:r>
+        <w:t xml:space="preserve">iki kez oynatılmaz (dedupe); katılımdan önceki hediyeler (</w:t>
+      </w:r>
+      <w:r>
+        <w:rPr>
+          <w:rStyle w:val="VerbatimChar"/>
+        </w:rPr>
+        <w:t xml:space="preserve">timestamp &lt; joinTimestamp</w:t>
+      </w:r>
+      <w:r>
+        <w:t xml:space="preserve">) animasyon oynatmaz.</w:t>
+      </w:r>
+    </w:p>
+    <w:p>
+      <w:pPr>
+        <w:numPr>
+          <w:ilvl w:val="0"/>
+          <w:numId w:val="1020"/>
+        </w:numPr>
+        <w:pStyle w:val="Compact"/>
+      </w:pPr>
+      <w:r>
+        <w:t xml:space="preserve">☐ Video hediyeler (</w:t>
+      </w:r>
+      <w:r>
+        <w:rPr>
+          <w:rStyle w:val="VerbatimChar"/>
+        </w:rPr>
+        <w:t xml:space="preserve">mp4</w:t>
+      </w:r>
+      <w:r>
+        <w:t xml:space="preserve">/</w:t>
+      </w:r>
+      <w:r>
+        <w:rPr>
+          <w:rStyle w:val="VerbatimChar"/>
+        </w:rPr>
+        <w:t xml:space="preserve">webm</w:t>
+      </w:r>
+      <w:r>
+        <w:t xml:space="preserve">) oynar; bitince controller</w:t>
+      </w:r>
+      <w:r>
+        <w:t xml:space="preserve"> </w:t>
+      </w:r>
+      <w:r>
+        <w:rPr>
+          <w:bCs/>
+          <w:b/>
+        </w:rPr>
+        <w:t xml:space="preserve">dispose</w:t>
+      </w:r>
+      <w:r>
+        <w:t xml:space="preserve"> </w:t>
+      </w:r>
+      <w:r>
+        <w:t xml:space="preserve">edilir; bellek şişmez.</w:t>
+      </w:r>
+      <w:r>
+        <w:t xml:space="preserve"> </w:t>
+      </w:r>
+      <w:r>
+        <w:rPr>
+          <w:rStyle w:val="VerbatimChar"/>
+        </w:rPr>
+        <w:t xml:space="preserve">svga</w:t>
+      </w:r>
+      <w:r>
+        <w:t xml:space="preserve">/</w:t>
+      </w:r>
+      <w:r>
+        <w:rPr>
+          <w:rStyle w:val="VerbatimChar"/>
+        </w:rPr>
+        <w:t xml:space="preserve">lottie</w:t>
+      </w:r>
+      <w:r>
+        <w:t xml:space="preserve">/</w:t>
+      </w:r>
+      <w:r>
+        <w:rPr>
+          <w:rStyle w:val="VerbatimChar"/>
+        </w:rPr>
+        <w:t xml:space="preserve">gif</w:t>
+      </w:r>
+      <w:r>
+        <w:t xml:space="preserve">/</w:t>
+      </w:r>
+      <w:r>
+        <w:rPr>
+          <w:rStyle w:val="VerbatimChar"/>
+        </w:rPr>
+        <w:t xml:space="preserve">png</w:t>
+      </w:r>
+      <w:r>
+        <w:t xml:space="preserve"> </w:t>
+      </w:r>
+      <w:r>
+        <w:t xml:space="preserve">doğru oynatıcıyla gösterilir (</w:t>
+      </w:r>
+      <w:r>
+        <w:rPr>
+          <w:rStyle w:val="VerbatimChar"/>
+        </w:rPr>
+        <w:t xml:space="preserve">assetFormat</w:t>
+      </w:r>
+      <w:r>
+        <w:t xml:space="preserve">).</w:t>
+      </w:r>
+    </w:p>
+    <w:p>
+      <w:pPr>
+        <w:numPr>
+          <w:ilvl w:val="0"/>
+          <w:numId w:val="1020"/>
+        </w:numPr>
+        <w:pStyle w:val="Compact"/>
+      </w:pPr>
+      <w:r>
+        <w:t xml:space="preserve">☐ Jeton metninde</w:t>
+      </w:r>
+      <w:r>
+        <w:t xml:space="preserve"> </w:t>
+      </w:r>
+      <w:r>
+        <w:t xml:space="preserve">“</w:t>
+      </w:r>
+      <w:r>
+        <w:t xml:space="preserve">Toplam</w:t>
+      </w:r>
+      <w:r>
+        <w:t xml:space="preserve">”</w:t>
+      </w:r>
+      <w:r>
+        <w:t xml:space="preserve"> </w:t>
+      </w:r>
+      <w:r>
+        <w:t xml:space="preserve">ve</w:t>
+      </w:r>
+      <w:r>
+        <w:t xml:space="preserve"> </w:t>
+      </w:r>
+      <w:r>
+        <w:t xml:space="preserve">“</w:t>
+      </w:r>
+      <w:r>
+        <w:t xml:space="preserve">Jeton</w:t>
+      </w:r>
+      <w:r>
+        <w:t xml:space="preserve">”</w:t>
+      </w:r>
+      <w:r>
+        <w:t xml:space="preserve"> </w:t>
+      </w:r>
+      <w:r>
+        <w:rPr>
+          <w:bCs/>
+          <w:b/>
+        </w:rPr>
+        <w:t xml:space="preserve">yok</w:t>
+      </w:r>
+      <w:r>
+        <w:t xml:space="preserve">; sadece sayı görünür.</w:t>
+      </w:r>
+    </w:p>
+    <w:p>
+      <w:pPr>
+        <w:numPr>
+          <w:ilvl w:val="0"/>
+          <w:numId w:val="1020"/>
+        </w:numPr>
+        <w:pStyle w:val="Compact"/>
+      </w:pPr>
+      <w:r>
+        <w:t xml:space="preserve">☐ Odadan çıkıp tekrar girince koltuğa</w:t>
+      </w:r>
+      <w:r>
+        <w:t xml:space="preserve"> </w:t>
+      </w:r>
+      <w:r>
+        <w:rPr>
+          <w:bCs/>
+          <w:b/>
+        </w:rPr>
+        <w:t xml:space="preserve">oturulabiliyor</w:t>
+      </w:r>
+      <w:r>
+        <w:t xml:space="preserve"> </w:t>
+      </w:r>
+      <w:r>
+        <w:t xml:space="preserve">(45sn stale + tam teardown); koltuklar gerçek zamanlı doğru.</w:t>
+      </w:r>
+    </w:p>
+    <w:p>
+      <w:pPr>
+        <w:numPr>
+          <w:ilvl w:val="0"/>
+          <w:numId w:val="1020"/>
+        </w:numPr>
+        <w:pStyle w:val="Compact"/>
+      </w:pPr>
+      <w:r>
+        <w:t xml:space="preserve">☐ Oda başına</w:t>
+      </w:r>
+      <w:r>
+        <w:t xml:space="preserve"> </w:t>
+      </w:r>
+      <w:r>
+        <w:rPr>
+          <w:bCs/>
+          <w:b/>
+        </w:rPr>
+        <w:t xml:space="preserve">tek</w:t>
+      </w:r>
+      <w:r>
+        <w:t xml:space="preserve"> </w:t>
+      </w:r>
+      <w:r>
+        <w:t xml:space="preserve">SSE bağlantısı; kopunca</w:t>
+      </w:r>
+      <w:r>
+        <w:t xml:space="preserve"> </w:t>
+      </w:r>
+      <w:r>
+        <w:rPr>
+          <w:bCs/>
+          <w:b/>
+        </w:rPr>
+        <w:t xml:space="preserve">Last-Event-ID</w:t>
+      </w:r>
+      <w:r>
+        <w:t xml:space="preserve"> </w:t>
+      </w:r>
+      <w:r>
+        <w:t xml:space="preserve">ile kaçırılan olaylar tekrar alınır.</w:t>
+      </w:r>
+    </w:p>
+    <w:p>
+      <w:pPr>
+        <w:numPr>
+          <w:ilvl w:val="0"/>
+          <w:numId w:val="1020"/>
+        </w:numPr>
+        <w:pStyle w:val="Compact"/>
+      </w:pPr>
+      <w:r>
+        <w:t xml:space="preserve">☐ Odadan çıkışta tüm controller/stream/timer/cache</w:t>
+      </w:r>
+      <w:r>
+        <w:t xml:space="preserve"> </w:t>
+      </w:r>
+      <w:r>
+        <w:rPr>
+          <w:bCs/>
+          <w:b/>
+        </w:rPr>
+        <w:t xml:space="preserve">temizlenir</w:t>
+      </w:r>
+      <w:r>
+        <w:t xml:space="preserve">; bellek sızıntısı yok.</w:t>
+      </w:r>
+    </w:p>
+    <w:p>
+      <w:pPr>
+        <w:numPr>
+          <w:ilvl w:val="0"/>
+          <w:numId w:val="1020"/>
+        </w:numPr>
+        <w:pStyle w:val="Compact"/>
+      </w:pPr>
+      <w:r>
+        <w:t xml:space="preserve">☐ Uygulama akıcı (Riverpod/Bloc + const + RepaintBoundary + sanal liste + lazy load); donma yok.</w:t>
+      </w:r>
+    </w:p>
+    <w:bookmarkEnd w:id="53"/>
+    <w:bookmarkEnd w:id="54"/>
+    <w:bookmarkEnd w:id="55"/>
     <w:sectPr/>
   </w:body>
 </w:document>
@@ -6919,6 +11201,30 @@
     <w:abstractNumId w:val="991"/>
   </w:num>
   <w:num w:numId="1012">
+    <w:abstractNumId w:val="991"/>
+  </w:num>
+  <w:num w:numId="1013">
+    <w:abstractNumId w:val="991"/>
+  </w:num>
+  <w:num w:numId="1014">
+    <w:abstractNumId w:val="991"/>
+  </w:num>
+  <w:num w:numId="1015">
+    <w:abstractNumId w:val="991"/>
+  </w:num>
+  <w:num w:numId="1016">
+    <w:abstractNumId w:val="991"/>
+  </w:num>
+  <w:num w:numId="1017">
+    <w:abstractNumId w:val="991"/>
+  </w:num>
+  <w:num w:numId="1018">
+    <w:abstractNumId w:val="991"/>
+  </w:num>
+  <w:num w:numId="1019">
+    <w:abstractNumId w:val="991"/>
+  </w:num>
+  <w:num w:numId="1020">
     <w:abstractNumId w:val="991"/>
   </w:num>
 </w:numbering>

</xml_diff>